<commit_message>
sdb adversary-complaint and motion-brief: typst and docx on the shared cross-engine layout model; make-reference.sh and reference.docx (EB Garamond, failing DEF-FONT-002) give way to docx/reference.xml (base="xengine", {font}); the adversary complaint in Times New Roman (13.8 pt single lines, allegation numbers hanging), docx XENG-001..003 pass on both samples, params.cross_engine: gate; the motion brief stays in TeX Gyre Termes as data/exemplar-fonts.json audits its exemplar (ligatures off for LibreOffice), its docx XENG-001/002 pass and XENG-003 is reported (cross_engine_docx: report: every line carries word for word, but LibreOffice's tall Termes word boxes give fb's line measure a centered title line's baseline from the line above; eps_v_pt 4.0 for the same boxes at the top margin); typst 18/8 and docx 26/11 checks passed, 0 failed (fb-595.68.9)
</commit_message>
<xml_diff>
--- a/courts/eighth-circuit/south-dakota/federal/bankruptcy-district/adversary-complaint/usage/OUTPUT-adversary-complaint-2.docx
+++ b/courts/eighth-circuit/south-dakota/federal/bankruptcy-district/adversary-complaint/usage/OUTPUT-adversary-complaint-2.docx
@@ -11,6 +11,7 @@
       <w:r>
         <w:rPr>
           <w:b/>
+          <w:bCs/>
         </w:rPr>
         <w:t xml:space="preserve">UNITED STATES BANKRUPTCY COURT</w:t>
       </w:r>
@@ -24,6 +25,7 @@
       <w:r>
         <w:rPr>
           <w:b/>
+          <w:bCs/>
         </w:rPr>
         <w:t xml:space="preserve">DISTRICT OF SOUTH DAKOTA</w:t>
       </w:r>
@@ -31,20 +33,14 @@
     <w:tbl>
       <w:tblPr>
         <w:tblW w:w="9360" w:type="dxa"/>
-        <w:tblBorders>
-          <w:top w:val="nil"/>
-          <w:left w:val="nil"/>
-          <w:bottom w:val="nil"/>
-          <w:right w:val="nil"/>
-          <w:insideH w:val="nil"/>
-          <w:insideV w:val="nil"/>
-        </w:tblBorders>
         <w:tblLayout w:type="fixed"/>
         <w:tblCellMar>
+          <w:top w:w="0" w:type="dxa"/>
           <w:left w:w="0" w:type="dxa"/>
+          <w:bottom w:w="0" w:type="dxa"/>
           <w:right w:w="0" w:type="dxa"/>
         </w:tblCellMar>
-        <w:tblLook w:val="0000"/>
+        <w:tblLook w:val="0000" w:firstRow="0" w:lastRow="0" w:firstColumn="0" w:lastColumn="0" w:noHBand="0" w:noVBand="0"/>
       </w:tblPr>
       <w:tblGrid>
         <w:gridCol w:w="4752"/>
@@ -63,6 +59,7 @@
             <w:pPr>
               <w:spacing w:before="0" w:after="0" w:line="276" w:lineRule="exact"/>
               <w:ind w:left="0" w:firstLine="0"/>
+              <w:jc w:val="left"/>
             </w:pPr>
             <w:r>
               <w:t xml:space="preserve">In re:</w:t>
@@ -77,6 +74,7 @@
             <w:pPr>
               <w:spacing w:before="0" w:after="0" w:line="276" w:lineRule="exact"/>
               <w:ind w:left="0" w:firstLine="0"/>
+              <w:jc w:val="left"/>
             </w:pPr>
             <w:r>
               <w:t xml:space="preserve">)</w:t>
@@ -91,9 +89,12 @@
             <w:pPr>
               <w:spacing w:before="0" w:after="0" w:line="276" w:lineRule="exact"/>
               <w:ind w:left="0" w:firstLine="0"/>
-            </w:pPr>
-            <w:r>
-              <w:t xml:space="preserve">Bankr. No. 00-00000</w:t>
+              <w:jc w:val="left"/>
+            </w:pPr>
+            <w:r>
+              <w:t xml:space="preserve">Bankr. No. 00</w:t>
+              <w:noBreakHyphen/>
+              <w:t xml:space="preserve">00000</w:t>
             </w:r>
           </w:p>
         </w:tc>
@@ -110,6 +111,7 @@
             <w:pPr>
               <w:spacing w:before="0" w:after="0" w:line="276" w:lineRule="exact"/>
               <w:ind w:left="0" w:firstLine="0"/>
+              <w:jc w:val="left"/>
             </w:pPr>
           </w:p>
         </w:tc>
@@ -121,6 +123,7 @@
             <w:pPr>
               <w:spacing w:before="0" w:after="0" w:line="276" w:lineRule="exact"/>
               <w:ind w:left="0" w:firstLine="0"/>
+              <w:jc w:val="left"/>
             </w:pPr>
             <w:r>
               <w:t xml:space="preserve">)</w:t>
@@ -135,6 +138,7 @@
             <w:pPr>
               <w:spacing w:before="0" w:after="0" w:line="276" w:lineRule="exact"/>
               <w:ind w:left="0" w:firstLine="0"/>
+              <w:jc w:val="left"/>
             </w:pPr>
             <w:r>
               <w:t xml:space="preserve">Chapter 7</w:t>
@@ -154,6 +158,7 @@
             <w:pPr>
               <w:spacing w:before="0" w:after="0" w:line="276" w:lineRule="exact"/>
               <w:ind w:left="0" w:firstLine="0"/>
+              <w:jc w:val="left"/>
             </w:pPr>
           </w:p>
         </w:tc>
@@ -165,6 +170,7 @@
             <w:pPr>
               <w:spacing w:before="0" w:after="0" w:line="276" w:lineRule="exact"/>
               <w:ind w:left="0" w:firstLine="0"/>
+              <w:jc w:val="left"/>
             </w:pPr>
             <w:r>
               <w:t xml:space="preserve">)</w:t>
@@ -179,6 +185,7 @@
             <w:pPr>
               <w:spacing w:before="0" w:after="0" w:line="276" w:lineRule="exact"/>
               <w:ind w:left="0" w:firstLine="0"/>
+              <w:jc w:val="left"/>
             </w:pPr>
           </w:p>
         </w:tc>
@@ -195,9 +202,22 @@
             <w:pPr>
               <w:spacing w:before="0" w:after="0" w:line="276" w:lineRule="exact"/>
               <w:ind w:left="0" w:firstLine="0"/>
-            </w:pPr>
-            <w:r>
-              <w:t xml:space="preserve">EXAMPLE DEBTOR ONE</w:t>
+              <w:jc w:val="left"/>
+            </w:pPr>
+            <w:r>
+              <w:t xml:space="preserve">EXAMPLE</w:t>
+            </w:r>
+            <w:r>
+              <w:t xml:space="preserve"> </w:t>
+            </w:r>
+            <w:r>
+              <w:t xml:space="preserve">DEBTOR</w:t>
+            </w:r>
+            <w:r>
+              <w:t xml:space="preserve"> </w:t>
+            </w:r>
+            <w:r>
+              <w:t xml:space="preserve">ONE</w:t>
             </w:r>
           </w:p>
         </w:tc>
@@ -209,6 +229,7 @@
             <w:pPr>
               <w:spacing w:before="0" w:after="0" w:line="276" w:lineRule="exact"/>
               <w:ind w:left="0" w:firstLine="0"/>
+              <w:jc w:val="left"/>
             </w:pPr>
             <w:r>
               <w:t xml:space="preserve">)</w:t>
@@ -223,6 +244,7 @@
             <w:pPr>
               <w:spacing w:before="0" w:after="0" w:line="276" w:lineRule="exact"/>
               <w:ind w:left="0" w:firstLine="0"/>
+              <w:jc w:val="left"/>
             </w:pPr>
           </w:p>
         </w:tc>
@@ -239,9 +261,12 @@
             <w:pPr>
               <w:spacing w:before="0" w:after="0" w:line="276" w:lineRule="exact"/>
               <w:ind w:left="0" w:firstLine="0"/>
-            </w:pPr>
-            <w:r>
-              <w:t xml:space="preserve">SSN xxx-xx-0000</w:t>
+              <w:jc w:val="left"/>
+            </w:pPr>
+            <w:r>
+              <w:t xml:space="preserve">SSN xxx-xx</w:t>
+              <w:noBreakHyphen/>
+              <w:t xml:space="preserve">0000</w:t>
             </w:r>
           </w:p>
         </w:tc>
@@ -253,6 +278,7 @@
             <w:pPr>
               <w:spacing w:before="0" w:after="0" w:line="276" w:lineRule="exact"/>
               <w:ind w:left="0" w:firstLine="0"/>
+              <w:jc w:val="left"/>
             </w:pPr>
             <w:r>
               <w:t xml:space="preserve">)</w:t>
@@ -267,6 +293,7 @@
             <w:pPr>
               <w:spacing w:before="0" w:after="0" w:line="276" w:lineRule="exact"/>
               <w:ind w:left="0" w:firstLine="0"/>
+              <w:jc w:val="left"/>
             </w:pPr>
           </w:p>
         </w:tc>
@@ -283,6 +310,7 @@
             <w:pPr>
               <w:spacing w:before="0" w:after="0" w:line="276" w:lineRule="exact"/>
               <w:ind w:left="0" w:firstLine="0"/>
+              <w:jc w:val="left"/>
             </w:pPr>
             <w:r>
               <w:t xml:space="preserve">fka EXAMPLE ALIAS ONE</w:t>
@@ -297,6 +325,7 @@
             <w:pPr>
               <w:spacing w:before="0" w:after="0" w:line="276" w:lineRule="exact"/>
               <w:ind w:left="0" w:firstLine="0"/>
+              <w:jc w:val="left"/>
             </w:pPr>
             <w:r>
               <w:t xml:space="preserve">)</w:t>
@@ -311,6 +340,7 @@
             <w:pPr>
               <w:spacing w:before="0" w:after="0" w:line="276" w:lineRule="exact"/>
               <w:ind w:left="0" w:firstLine="0"/>
+              <w:jc w:val="left"/>
             </w:pPr>
           </w:p>
         </w:tc>
@@ -327,6 +357,7 @@
             <w:pPr>
               <w:spacing w:before="0" w:after="0" w:line="276" w:lineRule="exact"/>
               <w:ind w:left="0" w:firstLine="0"/>
+              <w:jc w:val="left"/>
             </w:pPr>
           </w:p>
         </w:tc>
@@ -338,6 +369,7 @@
             <w:pPr>
               <w:spacing w:before="0" w:after="0" w:line="276" w:lineRule="exact"/>
               <w:ind w:left="0" w:firstLine="0"/>
+              <w:jc w:val="left"/>
             </w:pPr>
             <w:r>
               <w:t xml:space="preserve">)</w:t>
@@ -352,6 +384,7 @@
             <w:pPr>
               <w:spacing w:before="0" w:after="0" w:line="276" w:lineRule="exact"/>
               <w:ind w:left="0" w:firstLine="0"/>
+              <w:jc w:val="left"/>
             </w:pPr>
           </w:p>
         </w:tc>
@@ -368,9 +401,22 @@
             <w:pPr>
               <w:spacing w:before="0" w:after="0" w:line="276" w:lineRule="exact"/>
               <w:ind w:left="0" w:firstLine="0"/>
-            </w:pPr>
-            <w:r>
-              <w:t xml:space="preserve">EXAMPLE DEBTOR TWO</w:t>
+              <w:jc w:val="left"/>
+            </w:pPr>
+            <w:r>
+              <w:t xml:space="preserve">EXAMPLE</w:t>
+            </w:r>
+            <w:r>
+              <w:t xml:space="preserve"> </w:t>
+            </w:r>
+            <w:r>
+              <w:t xml:space="preserve">DEBTOR</w:t>
+            </w:r>
+            <w:r>
+              <w:t xml:space="preserve"> </w:t>
+            </w:r>
+            <w:r>
+              <w:t xml:space="preserve">TWO</w:t>
             </w:r>
           </w:p>
         </w:tc>
@@ -382,6 +428,7 @@
             <w:pPr>
               <w:spacing w:before="0" w:after="0" w:line="276" w:lineRule="exact"/>
               <w:ind w:left="0" w:firstLine="0"/>
+              <w:jc w:val="left"/>
             </w:pPr>
             <w:r>
               <w:t xml:space="preserve">)</w:t>
@@ -396,6 +443,7 @@
             <w:pPr>
               <w:spacing w:before="0" w:after="0" w:line="276" w:lineRule="exact"/>
               <w:ind w:left="0" w:firstLine="0"/>
+              <w:jc w:val="left"/>
             </w:pPr>
           </w:p>
         </w:tc>
@@ -412,9 +460,12 @@
             <w:pPr>
               <w:spacing w:before="0" w:after="0" w:line="276" w:lineRule="exact"/>
               <w:ind w:left="0" w:firstLine="0"/>
-            </w:pPr>
-            <w:r>
-              <w:t xml:space="preserve">SSN xxx-xx-1111</w:t>
+              <w:jc w:val="left"/>
+            </w:pPr>
+            <w:r>
+              <w:t xml:space="preserve">SSN xxx-xx</w:t>
+              <w:noBreakHyphen/>
+              <w:t xml:space="preserve">1111</w:t>
             </w:r>
           </w:p>
         </w:tc>
@@ -426,6 +477,7 @@
             <w:pPr>
               <w:spacing w:before="0" w:after="0" w:line="276" w:lineRule="exact"/>
               <w:ind w:left="0" w:firstLine="0"/>
+              <w:jc w:val="left"/>
             </w:pPr>
             <w:r>
               <w:t xml:space="preserve">)</w:t>
@@ -440,6 +492,7 @@
             <w:pPr>
               <w:spacing w:before="0" w:after="0" w:line="276" w:lineRule="exact"/>
               <w:ind w:left="0" w:firstLine="0"/>
+              <w:jc w:val="left"/>
             </w:pPr>
           </w:p>
         </w:tc>
@@ -456,6 +509,7 @@
             <w:pPr>
               <w:spacing w:before="0" w:after="0" w:line="276" w:lineRule="exact"/>
               <w:ind w:left="0" w:firstLine="0"/>
+              <w:jc w:val="left"/>
             </w:pPr>
           </w:p>
         </w:tc>
@@ -467,6 +521,7 @@
             <w:pPr>
               <w:spacing w:before="0" w:after="0" w:line="276" w:lineRule="exact"/>
               <w:ind w:left="0" w:firstLine="0"/>
+              <w:jc w:val="left"/>
             </w:pPr>
             <w:r>
               <w:t xml:space="preserve">)</w:t>
@@ -481,6 +536,7 @@
             <w:pPr>
               <w:spacing w:before="0" w:after="0" w:line="276" w:lineRule="exact"/>
               <w:ind w:left="0" w:firstLine="0"/>
+              <w:jc w:val="left"/>
             </w:pPr>
           </w:p>
         </w:tc>
@@ -512,6 +568,7 @@
             <w:pPr>
               <w:spacing w:before="0" w:after="0" w:line="276" w:lineRule="exact"/>
               <w:ind w:left="0" w:firstLine="0"/>
+              <w:jc w:val="left"/>
             </w:pPr>
             <w:r>
               <w:t xml:space="preserve">)</w:t>
@@ -526,6 +583,7 @@
             <w:pPr>
               <w:spacing w:before="0" w:after="0" w:line="276" w:lineRule="exact"/>
               <w:ind w:left="0" w:firstLine="0"/>
+              <w:jc w:val="left"/>
             </w:pPr>
           </w:p>
         </w:tc>
@@ -542,6 +600,7 @@
             <w:pPr>
               <w:spacing w:before="0" w:after="0" w:line="276" w:lineRule="exact"/>
               <w:ind w:left="0" w:firstLine="0"/>
+              <w:jc w:val="left"/>
             </w:pPr>
           </w:p>
         </w:tc>
@@ -553,6 +612,7 @@
             <w:pPr>
               <w:spacing w:before="0" w:after="0" w:line="276" w:lineRule="exact"/>
               <w:ind w:left="0" w:firstLine="0"/>
+              <w:jc w:val="left"/>
             </w:pPr>
             <w:r>
               <w:t xml:space="preserve">)</w:t>
@@ -567,6 +627,7 @@
             <w:pPr>
               <w:spacing w:before="0" w:after="0" w:line="276" w:lineRule="exact"/>
               <w:ind w:left="0" w:firstLine="0"/>
+              <w:jc w:val="left"/>
             </w:pPr>
           </w:p>
         </w:tc>
@@ -583,9 +644,22 @@
             <w:pPr>
               <w:spacing w:before="0" w:after="0" w:line="276" w:lineRule="exact"/>
               <w:ind w:left="0" w:firstLine="0"/>
-            </w:pPr>
-            <w:r>
-              <w:t xml:space="preserve">EXAMPLE CREDIT UNION</w:t>
+              <w:jc w:val="left"/>
+            </w:pPr>
+            <w:r>
+              <w:t xml:space="preserve">EXAMPLE</w:t>
+            </w:r>
+            <w:r>
+              <w:t xml:space="preserve"> </w:t>
+            </w:r>
+            <w:r>
+              <w:t xml:space="preserve">CREDIT</w:t>
+            </w:r>
+            <w:r>
+              <w:t xml:space="preserve"> </w:t>
+            </w:r>
+            <w:r>
+              <w:t xml:space="preserve">UNION</w:t>
             </w:r>
           </w:p>
         </w:tc>
@@ -597,6 +671,7 @@
             <w:pPr>
               <w:spacing w:before="0" w:after="0" w:line="276" w:lineRule="exact"/>
               <w:ind w:left="0" w:firstLine="0"/>
+              <w:jc w:val="left"/>
             </w:pPr>
             <w:r>
               <w:t xml:space="preserve">)</w:t>
@@ -611,9 +686,12 @@
             <w:pPr>
               <w:spacing w:before="0" w:after="0" w:line="276" w:lineRule="exact"/>
               <w:ind w:left="0" w:firstLine="0"/>
-            </w:pPr>
-            <w:r>
-              <w:t xml:space="preserve">Adv. No. 00-00001</w:t>
+              <w:jc w:val="left"/>
+            </w:pPr>
+            <w:r>
+              <w:t xml:space="preserve">Adv. No. 00</w:t>
+              <w:noBreakHyphen/>
+              <w:t xml:space="preserve">00001</w:t>
             </w:r>
           </w:p>
         </w:tc>
@@ -630,9 +708,22 @@
             <w:pPr>
               <w:spacing w:before="0" w:after="0" w:line="276" w:lineRule="exact"/>
               <w:ind w:left="0" w:firstLine="0"/>
-            </w:pPr>
-            <w:r>
-              <w:t xml:space="preserve">EXAMPLE SERVICING, LLC</w:t>
+              <w:jc w:val="left"/>
+            </w:pPr>
+            <w:r>
+              <w:t xml:space="preserve">EXAMPLE</w:t>
+            </w:r>
+            <w:r>
+              <w:t xml:space="preserve"> </w:t>
+            </w:r>
+            <w:r>
+              <w:t xml:space="preserve">SERVICING,</w:t>
+            </w:r>
+            <w:r>
+              <w:t xml:space="preserve"> </w:t>
+            </w:r>
+            <w:r>
+              <w:t xml:space="preserve">LLC</w:t>
             </w:r>
           </w:p>
         </w:tc>
@@ -644,6 +735,7 @@
             <w:pPr>
               <w:spacing w:before="0" w:after="0" w:line="276" w:lineRule="exact"/>
               <w:ind w:left="0" w:firstLine="0"/>
+              <w:jc w:val="left"/>
             </w:pPr>
             <w:r>
               <w:t xml:space="preserve">)</w:t>
@@ -658,6 +750,7 @@
             <w:pPr>
               <w:spacing w:before="0" w:after="0" w:line="276" w:lineRule="exact"/>
               <w:ind w:left="0" w:firstLine="0"/>
+              <w:jc w:val="left"/>
             </w:pPr>
           </w:p>
         </w:tc>
@@ -689,6 +782,7 @@
             <w:pPr>
               <w:spacing w:before="0" w:after="0" w:line="276" w:lineRule="exact"/>
               <w:ind w:left="0" w:firstLine="0"/>
+              <w:jc w:val="left"/>
             </w:pPr>
             <w:r>
               <w:t xml:space="preserve">)</w:t>
@@ -703,6 +797,7 @@
             <w:pPr>
               <w:spacing w:before="0" w:after="0" w:line="276" w:lineRule="exact"/>
               <w:ind w:left="0" w:firstLine="0"/>
+              <w:jc w:val="left"/>
             </w:pPr>
           </w:p>
         </w:tc>
@@ -719,6 +814,7 @@
             <w:pPr>
               <w:spacing w:before="0" w:after="0" w:line="276" w:lineRule="exact"/>
               <w:ind w:left="0" w:firstLine="0"/>
+              <w:jc w:val="left"/>
             </w:pPr>
           </w:p>
         </w:tc>
@@ -730,6 +826,7 @@
             <w:pPr>
               <w:spacing w:before="0" w:after="0" w:line="276" w:lineRule="exact"/>
               <w:ind w:left="0" w:firstLine="0"/>
+              <w:jc w:val="left"/>
             </w:pPr>
             <w:r>
               <w:t xml:space="preserve">)</w:t>
@@ -744,6 +841,7 @@
             <w:pPr>
               <w:spacing w:before="0" w:after="0" w:line="276" w:lineRule="exact"/>
               <w:ind w:left="0" w:firstLine="0"/>
+              <w:jc w:val="left"/>
             </w:pPr>
           </w:p>
         </w:tc>
@@ -760,6 +858,7 @@
             <w:pPr>
               <w:spacing w:before="0" w:after="0" w:line="276" w:lineRule="exact"/>
               <w:ind w:left="0" w:firstLine="0"/>
+              <w:jc w:val="left"/>
             </w:pPr>
             <w:r>
               <w:t xml:space="preserve">v.</w:t>
@@ -774,6 +873,7 @@
             <w:pPr>
               <w:spacing w:before="0" w:after="0" w:line="276" w:lineRule="exact"/>
               <w:ind w:left="0" w:firstLine="0"/>
+              <w:jc w:val="left"/>
             </w:pPr>
             <w:r>
               <w:t xml:space="preserve">)</w:t>
@@ -788,6 +888,7 @@
             <w:pPr>
               <w:spacing w:before="0" w:after="0" w:line="276" w:lineRule="exact"/>
               <w:ind w:left="0" w:firstLine="0"/>
+              <w:jc w:val="left"/>
             </w:pPr>
           </w:p>
         </w:tc>
@@ -804,6 +905,7 @@
             <w:pPr>
               <w:spacing w:before="0" w:after="0" w:line="276" w:lineRule="exact"/>
               <w:ind w:left="0" w:firstLine="0"/>
+              <w:jc w:val="left"/>
             </w:pPr>
           </w:p>
         </w:tc>
@@ -815,6 +917,7 @@
             <w:pPr>
               <w:spacing w:before="0" w:after="0" w:line="276" w:lineRule="exact"/>
               <w:ind w:left="0" w:firstLine="0"/>
+              <w:jc w:val="left"/>
             </w:pPr>
             <w:r>
               <w:t xml:space="preserve">)</w:t>
@@ -829,6 +932,7 @@
             <w:pPr>
               <w:spacing w:before="0" w:after="0" w:line="276" w:lineRule="exact"/>
               <w:ind w:left="0" w:firstLine="0"/>
+              <w:jc w:val="left"/>
             </w:pPr>
           </w:p>
         </w:tc>
@@ -845,9 +949,22 @@
             <w:pPr>
               <w:spacing w:before="0" w:after="0" w:line="276" w:lineRule="exact"/>
               <w:ind w:left="0" w:firstLine="0"/>
-            </w:pPr>
-            <w:r>
-              <w:t xml:space="preserve">EXAMPLE DEBTOR ONE</w:t>
+              <w:jc w:val="left"/>
+            </w:pPr>
+            <w:r>
+              <w:t xml:space="preserve">EXAMPLE</w:t>
+            </w:r>
+            <w:r>
+              <w:t xml:space="preserve"> </w:t>
+            </w:r>
+            <w:r>
+              <w:t xml:space="preserve">DEBTOR</w:t>
+            </w:r>
+            <w:r>
+              <w:t xml:space="preserve"> </w:t>
+            </w:r>
+            <w:r>
+              <w:t xml:space="preserve">ONE</w:t>
             </w:r>
           </w:p>
         </w:tc>
@@ -859,6 +976,7 @@
             <w:pPr>
               <w:spacing w:before="0" w:after="0" w:line="276" w:lineRule="exact"/>
               <w:ind w:left="0" w:firstLine="0"/>
+              <w:jc w:val="left"/>
             </w:pPr>
             <w:r>
               <w:t xml:space="preserve">)</w:t>
@@ -873,6 +991,7 @@
             <w:pPr>
               <w:spacing w:before="0" w:after="0" w:line="276" w:lineRule="exact"/>
               <w:ind w:left="0" w:firstLine="0"/>
+              <w:jc w:val="left"/>
             </w:pPr>
           </w:p>
         </w:tc>
@@ -892,7 +1011,13 @@
               <w:jc w:val="right"/>
             </w:pPr>
             <w:r>
-              <w:t xml:space="preserve">Defendant One,</w:t>
+              <w:t xml:space="preserve">Defendant</w:t>
+            </w:r>
+            <w:r>
+              <w:t xml:space="preserve"> </w:t>
+            </w:r>
+            <w:r>
+              <w:t xml:space="preserve">One,</w:t>
             </w:r>
           </w:p>
         </w:tc>
@@ -904,6 +1029,7 @@
             <w:pPr>
               <w:spacing w:before="0" w:after="0" w:line="276" w:lineRule="exact"/>
               <w:ind w:left="0" w:firstLine="0"/>
+              <w:jc w:val="left"/>
             </w:pPr>
             <w:r>
               <w:t xml:space="preserve">)</w:t>
@@ -918,6 +1044,7 @@
             <w:pPr>
               <w:spacing w:before="0" w:after="0" w:line="276" w:lineRule="exact"/>
               <w:ind w:left="0" w:firstLine="0"/>
+              <w:jc w:val="left"/>
             </w:pPr>
           </w:p>
         </w:tc>
@@ -934,9 +1061,22 @@
             <w:pPr>
               <w:spacing w:before="0" w:after="0" w:line="276" w:lineRule="exact"/>
               <w:ind w:left="0" w:firstLine="0"/>
-            </w:pPr>
-            <w:r>
-              <w:t xml:space="preserve">EXAMPLE DEBTOR TWO</w:t>
+              <w:jc w:val="left"/>
+            </w:pPr>
+            <w:r>
+              <w:t xml:space="preserve">EXAMPLE</w:t>
+            </w:r>
+            <w:r>
+              <w:t xml:space="preserve"> </w:t>
+            </w:r>
+            <w:r>
+              <w:t xml:space="preserve">DEBTOR</w:t>
+            </w:r>
+            <w:r>
+              <w:t xml:space="preserve"> </w:t>
+            </w:r>
+            <w:r>
+              <w:t xml:space="preserve">TWO</w:t>
             </w:r>
           </w:p>
         </w:tc>
@@ -948,6 +1088,7 @@
             <w:pPr>
               <w:spacing w:before="0" w:after="0" w:line="276" w:lineRule="exact"/>
               <w:ind w:left="0" w:firstLine="0"/>
+              <w:jc w:val="left"/>
             </w:pPr>
             <w:r>
               <w:t xml:space="preserve">)</w:t>
@@ -962,6 +1103,7 @@
             <w:pPr>
               <w:spacing w:before="0" w:after="0" w:line="276" w:lineRule="exact"/>
               <w:ind w:left="0" w:firstLine="0"/>
+              <w:jc w:val="left"/>
             </w:pPr>
           </w:p>
         </w:tc>
@@ -981,7 +1123,13 @@
               <w:jc w:val="right"/>
             </w:pPr>
             <w:r>
-              <w:t xml:space="preserve">Defendant Two.</w:t>
+              <w:t xml:space="preserve">Defendant</w:t>
+            </w:r>
+            <w:r>
+              <w:t xml:space="preserve"> </w:t>
+            </w:r>
+            <w:r>
+              <w:t xml:space="preserve">Two.</w:t>
             </w:r>
           </w:p>
         </w:tc>
@@ -993,6 +1141,7 @@
             <w:pPr>
               <w:spacing w:before="0" w:after="0" w:line="276" w:lineRule="exact"/>
               <w:ind w:left="0" w:firstLine="0"/>
+              <w:jc w:val="left"/>
             </w:pPr>
             <w:r>
               <w:t xml:space="preserve">)</w:t>
@@ -1007,6 +1156,7 @@
             <w:pPr>
               <w:spacing w:before="0" w:after="0" w:line="276" w:lineRule="exact"/>
               <w:ind w:left="0" w:firstLine="0"/>
+              <w:jc w:val="left"/>
             </w:pPr>
           </w:p>
         </w:tc>
@@ -1021,92 +1171,1157 @@
       <w:r>
         <w:rPr>
           <w:b/>
-        </w:rPr>
-        <w:t xml:space="preserve">COMPLAINT TO DETERMINE DISCHARGEABILITY OF DEBTS (11 U.S.C. § 523(a)(2)(A) AND (a)(6))</w:t>
+          <w:bCs/>
+        </w:rPr>
+        <w:t xml:space="preserve">COMPLAINT</w:t>
+      </w:r>
+      <w:r>
+        <w:rPr>
+          <w:b/>
+          <w:bCs/>
+        </w:rPr>
+        <w:t xml:space="preserve"> </w:t>
+      </w:r>
+      <w:r>
+        <w:rPr>
+          <w:b/>
+          <w:bCs/>
+        </w:rPr>
+        <w:t xml:space="preserve">TO</w:t>
+      </w:r>
+      <w:r>
+        <w:rPr>
+          <w:b/>
+          <w:bCs/>
+        </w:rPr>
+        <w:t xml:space="preserve"> </w:t>
+      </w:r>
+      <w:r>
+        <w:rPr>
+          <w:b/>
+          <w:bCs/>
+        </w:rPr>
+        <w:t xml:space="preserve">DETERMINE</w:t>
+      </w:r>
+      <w:r>
+        <w:rPr>
+          <w:b/>
+          <w:bCs/>
+        </w:rPr>
+        <w:t xml:space="preserve"> </w:t>
+      </w:r>
+      <w:r>
+        <w:rPr>
+          <w:b/>
+          <w:bCs/>
+        </w:rPr>
+        <w:t xml:space="preserve">DISCHARGEABILITY</w:t>
+      </w:r>
+      <w:r>
+        <w:rPr>
+          <w:b/>
+          <w:bCs/>
+        </w:rPr>
+        <w:t xml:space="preserve"> </w:t>
+      </w:r>
+      <w:r>
+        <w:rPr>
+          <w:b/>
+          <w:bCs/>
+        </w:rPr>
+        <w:t xml:space="preserve">OF</w:t>
+      </w:r>
+      <w:r>
+        <w:rPr>
+          <w:b/>
+          <w:bCs/>
+        </w:rPr>
+        <w:t xml:space="preserve"> </w:t>
+      </w:r>
+      <w:r>
+        <w:rPr>
+          <w:b/>
+          <w:bCs/>
+        </w:rPr>
+        <w:t xml:space="preserve">DEBTS</w:t>
+      </w:r>
+      <w:r>
+        <w:rPr>
+          <w:b/>
+          <w:bCs/>
+        </w:rPr>
+        <w:t xml:space="preserve"> </w:t>
+      </w:r>
+      <w:r>
+        <w:rPr>
+          <w:b/>
+          <w:bCs/>
+        </w:rPr>
+        <w:t xml:space="preserve">(11</w:t>
+      </w:r>
+      <w:r>
+        <w:rPr>
+          <w:b/>
+          <w:bCs/>
+        </w:rPr>
+        <w:t xml:space="preserve"> </w:t>
+      </w:r>
+      <w:r>
+        <w:rPr>
+          <w:b/>
+          <w:bCs/>
+        </w:rPr>
+        <w:t xml:space="preserve">U.S.C.</w:t>
+      </w:r>
+      <w:r>
+        <w:rPr>
+          <w:b/>
+          <w:bCs/>
+        </w:rPr>
+        <w:t xml:space="preserve"> </w:t>
+      </w:r>
+      <w:r>
+        <w:rPr>
+          <w:b/>
+          <w:bCs/>
+        </w:rPr>
+        <w:t xml:space="preserve">§ 523(a)⁠(2)⁠(A)</w:t>
+      </w:r>
+      <w:r>
+        <w:rPr>
+          <w:b/>
+          <w:bCs/>
+        </w:rPr>
+        <w:t xml:space="preserve"> </w:t>
+      </w:r>
+      <w:r>
+        <w:rPr>
+          <w:b/>
+          <w:bCs/>
+        </w:rPr>
+        <w:t xml:space="preserve">AND</w:t>
+      </w:r>
+      <w:r>
+        <w:rPr>
+          <w:b/>
+          <w:bCs/>
+        </w:rPr>
+        <w:t xml:space="preserve"> </w:t>
+      </w:r>
+      <w:r>
+        <w:rPr>
+          <w:b/>
+          <w:bCs/>
+        </w:rPr>
+        <w:t xml:space="preserve">(a)⁠(6))</w:t>
       </w:r>
     </w:p>
     <w:p>
       <w:pPr>
-        <w:spacing w:before="0" w:after="240" w:line="276" w:lineRule="exact"/>
-        <w:ind w:left="0" w:firstLine="0"/>
+        <w:spacing w:before="240" w:after="240" w:line="276" w:lineRule="exact"/>
+        <w:ind w:left="0" w:firstLine="720"/>
+        <w:jc w:val="left"/>
       </w:pPr>
       <w:r>
-        <w:t xml:space="preserve">COME NOW Plaintiffs, by and through their attorney, EXAMPLE COUNSEL, to allege and complain as follows:</w:t>
+        <w:t xml:space="preserve">COME</w:t>
+      </w:r>
+      <w:r>
+        <w:t xml:space="preserve"> </w:t>
+      </w:r>
+      <w:r>
+        <w:t xml:space="preserve">NOW</w:t>
+      </w:r>
+      <w:r>
+        <w:t xml:space="preserve"> </w:t>
+      </w:r>
+      <w:r>
+        <w:t xml:space="preserve">Plaintiffs,</w:t>
+      </w:r>
+      <w:r>
+        <w:t xml:space="preserve"> </w:t>
+      </w:r>
+      <w:r>
+        <w:t xml:space="preserve">by</w:t>
+      </w:r>
+      <w:r>
+        <w:t xml:space="preserve"> </w:t>
+      </w:r>
+      <w:r>
+        <w:t xml:space="preserve">and</w:t>
+      </w:r>
+      <w:r>
+        <w:t xml:space="preserve"> </w:t>
+      </w:r>
+      <w:r>
+        <w:t xml:space="preserve">through</w:t>
+      </w:r>
+      <w:r>
+        <w:t xml:space="preserve"> </w:t>
+      </w:r>
+      <w:r>
+        <w:t xml:space="preserve">their</w:t>
+      </w:r>
+      <w:r>
+        <w:t xml:space="preserve"> </w:t>
+      </w:r>
+      <w:r>
+        <w:t xml:space="preserve">attorney,</w:t>
+      </w:r>
+      <w:r>
+        <w:t xml:space="preserve"> </w:t>
+      </w:r>
+      <w:r>
+        <w:t xml:space="preserve">EXAMPLE</w:t>
+      </w:r>
+      <w:r>
+        <w:t xml:space="preserve"> </w:t>
+      </w:r>
+      <w:r>
+        <w:t xml:space="preserve">COUNSEL,</w:t>
+      </w:r>
+      <w:r>
+        <w:t xml:space="preserve"> </w:t>
+      </w:r>
+      <w:r>
+        <w:t xml:space="preserve">to</w:t>
+      </w:r>
+      <w:r>
+        <w:t xml:space="preserve"> </w:t>
+      </w:r>
+      <w:r>
+        <w:t xml:space="preserve">allege</w:t>
+      </w:r>
+      <w:r>
+        <w:t xml:space="preserve"> </w:t>
+      </w:r>
+      <w:r>
+        <w:t xml:space="preserve">and</w:t>
+      </w:r>
+      <w:r>
+        <w:t xml:space="preserve"> </w:t>
+      </w:r>
+      <w:r>
+        <w:t xml:space="preserve">complain</w:t>
+      </w:r>
+      <w:r>
+        <w:t xml:space="preserve"> </w:t>
+      </w:r>
+      <w:r>
+        <w:t xml:space="preserve">as</w:t>
+      </w:r>
+      <w:r>
+        <w:t xml:space="preserve"> </w:t>
+      </w:r>
+      <w:r>
+        <w:t xml:space="preserve">follows:</w:t>
       </w:r>
     </w:p>
-    <w:bookmarkStart w:id="20" w:name="i.-parties-and-jurisdiction"/>
     <w:p>
       <w:pPr>
         <w:pStyle w:val="Heading1"/>
+        <w:keepNext/>
+        <w:keepLines/>
+        <w:spacing w:before="360" w:after="240" w:line="276" w:lineRule="exact"/>
+        <w:ind w:left="0" w:firstLine="0"/>
+        <w:jc w:val="center"/>
       </w:pPr>
       <w:r>
-        <w:t xml:space="preserve">I. PARTIES AND JURISDICTION</w:t>
+        <w:rPr>
+          <w:b/>
+          <w:bCs/>
+          <w:caps w:val="0"/>
+        </w:rPr>
+        <w:t xml:space="preserve">I.</w:t>
+      </w:r>
+      <w:r>
+        <w:rPr>
+          <w:b/>
+          <w:bCs/>
+          <w:caps w:val="0"/>
+        </w:rPr>
+        <w:t xml:space="preserve"> </w:t>
+      </w:r>
+      <w:r>
+        <w:rPr>
+          <w:b/>
+          <w:bCs/>
+          <w:caps w:val="0"/>
+        </w:rPr>
+        <w:t xml:space="preserve">PARTIES</w:t>
+      </w:r>
+      <w:r>
+        <w:rPr>
+          <w:b/>
+          <w:bCs/>
+          <w:caps w:val="0"/>
+        </w:rPr>
+        <w:t xml:space="preserve"> </w:t>
+      </w:r>
+      <w:r>
+        <w:rPr>
+          <w:b/>
+          <w:bCs/>
+          <w:caps w:val="0"/>
+        </w:rPr>
+        <w:t xml:space="preserve">AND</w:t>
+      </w:r>
+      <w:r>
+        <w:rPr>
+          <w:b/>
+          <w:bCs/>
+          <w:caps w:val="0"/>
+        </w:rPr>
+        <w:t xml:space="preserve"> </w:t>
+      </w:r>
+      <w:r>
+        <w:rPr>
+          <w:b/>
+          <w:bCs/>
+          <w:caps w:val="0"/>
+        </w:rPr>
+        <w:t xml:space="preserve">JURISDICTION</w:t>
       </w:r>
     </w:p>
     <w:p>
       <w:pPr>
-        <w:pStyle w:val="FirstParagraph"/>
+        <w:spacing w:before="240" w:after="240" w:line="276" w:lineRule="exact"/>
+        <w:ind w:left="720" w:hanging="720"/>
+        <w:jc w:val="left"/>
       </w:pPr>
       <w:r>
-        <w:t xml:space="preserve">1. Plaintiff EXAMPLE CREDIT UNION is a credit union organized under the laws of the State of South Dakota.</w:t>
+        <w:t xml:space="preserve">1.</w:t>
+      </w:r>
+      <w:r>
+        <w:tab/>
+      </w:r>
+      <w:r>
+        <w:t xml:space="preserve">Plaintiff</w:t>
+      </w:r>
+      <w:r>
+        <w:t xml:space="preserve"> </w:t>
+      </w:r>
+      <w:r>
+        <w:t xml:space="preserve">EXAMPLE</w:t>
+      </w:r>
+      <w:r>
+        <w:t xml:space="preserve"> </w:t>
+      </w:r>
+      <w:r>
+        <w:t xml:space="preserve">CREDIT</w:t>
+      </w:r>
+      <w:r>
+        <w:t xml:space="preserve"> </w:t>
+      </w:r>
+      <w:r>
+        <w:t xml:space="preserve">UNION</w:t>
+      </w:r>
+      <w:r>
+        <w:t xml:space="preserve"> </w:t>
+      </w:r>
+      <w:r>
+        <w:t xml:space="preserve">is</w:t>
+      </w:r>
+      <w:r>
+        <w:t xml:space="preserve"> </w:t>
+      </w:r>
+      <w:r>
+        <w:t xml:space="preserve">a</w:t>
+      </w:r>
+      <w:r>
+        <w:t xml:space="preserve"> </w:t>
+      </w:r>
+      <w:r>
+        <w:t xml:space="preserve">credit</w:t>
+      </w:r>
+      <w:r>
+        <w:t xml:space="preserve"> </w:t>
+      </w:r>
+      <w:r>
+        <w:t xml:space="preserve">union</w:t>
+      </w:r>
+      <w:r>
+        <w:t xml:space="preserve"> </w:t>
+      </w:r>
+      <w:r>
+        <w:t xml:space="preserve">organized</w:t>
+      </w:r>
+      <w:r>
+        <w:t xml:space="preserve"> </w:t>
+      </w:r>
+      <w:r>
+        <w:t xml:space="preserve">under</w:t>
+      </w:r>
+      <w:r>
+        <w:t xml:space="preserve"> </w:t>
+      </w:r>
+      <w:r>
+        <w:t xml:space="preserve">the</w:t>
+      </w:r>
+      <w:r>
+        <w:t xml:space="preserve"> </w:t>
+      </w:r>
+      <w:r>
+        <w:t xml:space="preserve">laws</w:t>
+      </w:r>
+      <w:r>
+        <w:t xml:space="preserve"> </w:t>
+      </w:r>
+      <w:r>
+        <w:t xml:space="preserve">of</w:t>
+      </w:r>
+      <w:r>
+        <w:t xml:space="preserve"> </w:t>
+      </w:r>
+      <w:r>
+        <w:t xml:space="preserve">the</w:t>
+      </w:r>
+      <w:r>
+        <w:t xml:space="preserve"> </w:t>
+      </w:r>
+      <w:r>
+        <w:t xml:space="preserve">State</w:t>
+      </w:r>
+      <w:r>
+        <w:t xml:space="preserve"> </w:t>
+      </w:r>
+      <w:r>
+        <w:t xml:space="preserve">of</w:t>
+      </w:r>
+      <w:r>
+        <w:t xml:space="preserve"> </w:t>
+      </w:r>
+      <w:r>
+        <w:t xml:space="preserve">South</w:t>
+      </w:r>
+      <w:r>
+        <w:t xml:space="preserve"> </w:t>
+      </w:r>
+      <w:r>
+        <w:t xml:space="preserve">Dakota.</w:t>
       </w:r>
     </w:p>
     <w:p>
       <w:pPr>
-        <w:pStyle w:val="BodyText"/>
+        <w:spacing w:before="240" w:after="240" w:line="276" w:lineRule="exact"/>
+        <w:ind w:left="720" w:hanging="720"/>
+        <w:jc w:val="left"/>
       </w:pPr>
       <w:r>
-        <w:t xml:space="preserve">2. Plaintiff EXAMPLE SERVICING, LLC is a limited liability company that services loans for Plaintiff EXAMPLE CREDIT UNION.</w:t>
+        <w:t xml:space="preserve">2.</w:t>
+      </w:r>
+      <w:r>
+        <w:tab/>
+      </w:r>
+      <w:r>
+        <w:t xml:space="preserve">Plaintiff</w:t>
+      </w:r>
+      <w:r>
+        <w:t xml:space="preserve"> </w:t>
+      </w:r>
+      <w:r>
+        <w:t xml:space="preserve">EXAMPLE</w:t>
+      </w:r>
+      <w:r>
+        <w:t xml:space="preserve"> </w:t>
+      </w:r>
+      <w:r>
+        <w:t xml:space="preserve">SERVICING,</w:t>
+      </w:r>
+      <w:r>
+        <w:t xml:space="preserve"> </w:t>
+      </w:r>
+      <w:r>
+        <w:t xml:space="preserve">LLC</w:t>
+      </w:r>
+      <w:r>
+        <w:t xml:space="preserve"> </w:t>
+      </w:r>
+      <w:r>
+        <w:t xml:space="preserve">is</w:t>
+      </w:r>
+      <w:r>
+        <w:t xml:space="preserve"> </w:t>
+      </w:r>
+      <w:r>
+        <w:t xml:space="preserve">a</w:t>
+      </w:r>
+      <w:r>
+        <w:t xml:space="preserve"> </w:t>
+      </w:r>
+      <w:r>
+        <w:t xml:space="preserve">limited</w:t>
+      </w:r>
+      <w:r>
+        <w:t xml:space="preserve"> </w:t>
+      </w:r>
+      <w:r>
+        <w:t xml:space="preserve">liability</w:t>
+      </w:r>
+      <w:r>
+        <w:t xml:space="preserve"> </w:t>
+      </w:r>
+      <w:r>
+        <w:t xml:space="preserve">company</w:t>
+      </w:r>
+      <w:r>
+        <w:t xml:space="preserve"> </w:t>
+      </w:r>
+      <w:r>
+        <w:t xml:space="preserve">that</w:t>
+      </w:r>
+      <w:r>
+        <w:t xml:space="preserve"> </w:t>
+      </w:r>
+      <w:r>
+        <w:t xml:space="preserve">services</w:t>
+      </w:r>
+      <w:r>
+        <w:t xml:space="preserve"> </w:t>
+      </w:r>
+      <w:r>
+        <w:t xml:space="preserve">loans</w:t>
+      </w:r>
+      <w:r>
+        <w:t xml:space="preserve"> </w:t>
+      </w:r>
+      <w:r>
+        <w:t xml:space="preserve">for</w:t>
+      </w:r>
+      <w:r>
+        <w:t xml:space="preserve"> </w:t>
+      </w:r>
+      <w:r>
+        <w:t xml:space="preserve">Plaintiff</w:t>
+      </w:r>
+      <w:r>
+        <w:t xml:space="preserve"> </w:t>
+      </w:r>
+      <w:r>
+        <w:t xml:space="preserve">EXAMPLE</w:t>
+      </w:r>
+      <w:r>
+        <w:t xml:space="preserve"> </w:t>
+      </w:r>
+      <w:r>
+        <w:t xml:space="preserve">CREDIT</w:t>
+      </w:r>
+      <w:r>
+        <w:t xml:space="preserve"> </w:t>
+      </w:r>
+      <w:r>
+        <w:t xml:space="preserve">UNION.</w:t>
       </w:r>
     </w:p>
     <w:p>
       <w:pPr>
-        <w:pStyle w:val="BodyText"/>
+        <w:spacing w:before="240" w:after="240" w:line="276" w:lineRule="exact"/>
+        <w:ind w:left="720" w:hanging="720"/>
+        <w:jc w:val="left"/>
       </w:pPr>
       <w:r>
-        <w:t xml:space="preserve">3. Defendants filed a joint Chapter 7 petition on January 15, 2000, in this Court.</w:t>
+        <w:t xml:space="preserve">3.</w:t>
+      </w:r>
+      <w:r>
+        <w:tab/>
+      </w:r>
+      <w:r>
+        <w:t xml:space="preserve">Defendants</w:t>
+      </w:r>
+      <w:r>
+        <w:t xml:space="preserve"> </w:t>
+      </w:r>
+      <w:r>
+        <w:t xml:space="preserve">filed</w:t>
+      </w:r>
+      <w:r>
+        <w:t xml:space="preserve"> </w:t>
+      </w:r>
+      <w:r>
+        <w:t xml:space="preserve">a</w:t>
+      </w:r>
+      <w:r>
+        <w:t xml:space="preserve"> </w:t>
+      </w:r>
+      <w:r>
+        <w:t xml:space="preserve">joint</w:t>
+      </w:r>
+      <w:r>
+        <w:t xml:space="preserve"> </w:t>
+      </w:r>
+      <w:r>
+        <w:t xml:space="preserve">Chapter</w:t>
+      </w:r>
+      <w:r>
+        <w:t xml:space="preserve"> </w:t>
+      </w:r>
+      <w:r>
+        <w:t xml:space="preserve">7</w:t>
+      </w:r>
+      <w:r>
+        <w:t xml:space="preserve"> </w:t>
+      </w:r>
+      <w:r>
+        <w:t xml:space="preserve">petition</w:t>
+      </w:r>
+      <w:r>
+        <w:t xml:space="preserve"> </w:t>
+      </w:r>
+      <w:r>
+        <w:t xml:space="preserve">on</w:t>
+      </w:r>
+      <w:r>
+        <w:t xml:space="preserve"> </w:t>
+      </w:r>
+      <w:r>
+        <w:t xml:space="preserve">January</w:t>
+      </w:r>
+      <w:r>
+        <w:t xml:space="preserve"> </w:t>
+      </w:r>
+      <w:r>
+        <w:t xml:space="preserve">15,</w:t>
+      </w:r>
+      <w:r>
+        <w:t xml:space="preserve"> </w:t>
+      </w:r>
+      <w:r>
+        <w:t xml:space="preserve">2000,</w:t>
+      </w:r>
+      <w:r>
+        <w:t xml:space="preserve"> </w:t>
+      </w:r>
+      <w:r>
+        <w:t xml:space="preserve">in</w:t>
+      </w:r>
+      <w:r>
+        <w:t xml:space="preserve"> </w:t>
+      </w:r>
+      <w:r>
+        <w:t xml:space="preserve">this</w:t>
+      </w:r>
+      <w:r>
+        <w:t xml:space="preserve"> </w:t>
+      </w:r>
+      <w:r>
+        <w:t xml:space="preserve">Court.</w:t>
       </w:r>
     </w:p>
     <w:p>
       <w:pPr>
-        <w:pStyle w:val="BodyText"/>
+        <w:spacing w:before="240" w:after="240" w:line="276" w:lineRule="exact"/>
+        <w:ind w:left="720" w:hanging="720"/>
+        <w:jc w:val="left"/>
       </w:pPr>
       <w:r>
-        <w:t xml:space="preserve">4. This adversary proceeding arises under 11 U.S.C. §§ 523(a)(2)(A) and 523(a)(6) and is a core proceeding under 28 U.S.C. § 157(b)(2)(I).</w:t>
+        <w:t xml:space="preserve">4.</w:t>
+      </w:r>
+      <w:r>
+        <w:tab/>
+      </w:r>
+      <w:r>
+        <w:t xml:space="preserve">This</w:t>
+      </w:r>
+      <w:r>
+        <w:t xml:space="preserve"> </w:t>
+      </w:r>
+      <w:r>
+        <w:t xml:space="preserve">adversary</w:t>
+      </w:r>
+      <w:r>
+        <w:t xml:space="preserve"> </w:t>
+      </w:r>
+      <w:r>
+        <w:t xml:space="preserve">proceeding</w:t>
+      </w:r>
+      <w:r>
+        <w:t xml:space="preserve"> </w:t>
+      </w:r>
+      <w:r>
+        <w:t xml:space="preserve">arises</w:t>
+      </w:r>
+      <w:r>
+        <w:t xml:space="preserve"> </w:t>
+      </w:r>
+      <w:r>
+        <w:t xml:space="preserve">under</w:t>
+      </w:r>
+      <w:r>
+        <w:t xml:space="preserve"> </w:t>
+      </w:r>
+      <w:r>
+        <w:t xml:space="preserve">11</w:t>
+      </w:r>
+      <w:r>
+        <w:t xml:space="preserve"> </w:t>
+      </w:r>
+      <w:r>
+        <w:t xml:space="preserve">U.S.C.</w:t>
+      </w:r>
+      <w:r>
+        <w:t xml:space="preserve"> </w:t>
+      </w:r>
+      <w:r>
+        <w:t xml:space="preserve">§​§</w:t>
+      </w:r>
+      <w:r>
+        <w:t xml:space="preserve"> </w:t>
+      </w:r>
+      <w:r>
+        <w:t xml:space="preserve">523(a)⁠(2)⁠(A)</w:t>
+      </w:r>
+      <w:r>
+        <w:t xml:space="preserve"> </w:t>
+      </w:r>
+      <w:r>
+        <w:t xml:space="preserve">and</w:t>
+      </w:r>
+      <w:r>
+        <w:t xml:space="preserve"> </w:t>
+      </w:r>
+      <w:r>
+        <w:t xml:space="preserve">523(a)⁠(6)</w:t>
+      </w:r>
+      <w:r>
+        <w:t xml:space="preserve"> </w:t>
+      </w:r>
+      <w:r>
+        <w:t xml:space="preserve">and</w:t>
+      </w:r>
+      <w:r>
+        <w:t xml:space="preserve"> </w:t>
+      </w:r>
+      <w:r>
+        <w:t xml:space="preserve">is</w:t>
+      </w:r>
+      <w:r>
+        <w:t xml:space="preserve"> </w:t>
+      </w:r>
+      <w:r>
+        <w:t xml:space="preserve">a</w:t>
+      </w:r>
+      <w:r>
+        <w:t xml:space="preserve"> </w:t>
+      </w:r>
+      <w:r>
+        <w:t xml:space="preserve">core</w:t>
+      </w:r>
+      <w:r>
+        <w:t xml:space="preserve"> </w:t>
+      </w:r>
+      <w:r>
+        <w:t xml:space="preserve">proceeding</w:t>
+      </w:r>
+      <w:r>
+        <w:t xml:space="preserve"> </w:t>
+      </w:r>
+      <w:r>
+        <w:t xml:space="preserve">under</w:t>
+      </w:r>
+      <w:r>
+        <w:t xml:space="preserve"> </w:t>
+      </w:r>
+      <w:r>
+        <w:t xml:space="preserve">28</w:t>
+      </w:r>
+      <w:r>
+        <w:t xml:space="preserve"> </w:t>
+      </w:r>
+      <w:r>
+        <w:t xml:space="preserve">U.S.C.</w:t>
+      </w:r>
+      <w:r>
+        <w:t xml:space="preserve"> </w:t>
+      </w:r>
+      <w:r>
+        <w:t xml:space="preserve">§</w:t>
+      </w:r>
+      <w:r>
+        <w:t xml:space="preserve"> </w:t>
+      </w:r>
+      <w:r>
+        <w:t xml:space="preserve">157(b)⁠(2)⁠(I).</w:t>
       </w:r>
     </w:p>
     <w:p>
       <w:pPr>
-        <w:pStyle w:val="BodyText"/>
+        <w:spacing w:before="240" w:after="240" w:line="276" w:lineRule="exact"/>
+        <w:ind w:left="720" w:hanging="720"/>
+        <w:jc w:val="left"/>
       </w:pPr>
       <w:r>
-        <w:t xml:space="preserve">5. Plaintiffs do not consent to the entry of final orders or judgment by the bankruptcy court.</w:t>
+        <w:t xml:space="preserve">5.</w:t>
+      </w:r>
+      <w:r>
+        <w:tab/>
+      </w:r>
+      <w:r>
+        <w:t xml:space="preserve">Plaintiffs</w:t>
+      </w:r>
+      <w:r>
+        <w:t xml:space="preserve"> </w:t>
+      </w:r>
+      <w:r>
+        <w:t xml:space="preserve">do</w:t>
+      </w:r>
+      <w:r>
+        <w:t xml:space="preserve"> </w:t>
+      </w:r>
+      <w:r>
+        <w:t xml:space="preserve">not</w:t>
+      </w:r>
+      <w:r>
+        <w:t xml:space="preserve"> </w:t>
+      </w:r>
+      <w:r>
+        <w:t xml:space="preserve">consent</w:t>
+      </w:r>
+      <w:r>
+        <w:t xml:space="preserve"> </w:t>
+      </w:r>
+      <w:r>
+        <w:t xml:space="preserve">to</w:t>
+      </w:r>
+      <w:r>
+        <w:t xml:space="preserve"> </w:t>
+      </w:r>
+      <w:r>
+        <w:t xml:space="preserve">the</w:t>
+      </w:r>
+      <w:r>
+        <w:t xml:space="preserve"> </w:t>
+      </w:r>
+      <w:r>
+        <w:t xml:space="preserve">entry</w:t>
+      </w:r>
+      <w:r>
+        <w:t xml:space="preserve"> </w:t>
+      </w:r>
+      <w:r>
+        <w:t xml:space="preserve">of</w:t>
+      </w:r>
+      <w:r>
+        <w:t xml:space="preserve"> </w:t>
+      </w:r>
+      <w:r>
+        <w:t xml:space="preserve">final</w:t>
+      </w:r>
+      <w:r>
+        <w:t xml:space="preserve"> </w:t>
+      </w:r>
+      <w:r>
+        <w:t xml:space="preserve">orders</w:t>
+      </w:r>
+      <w:r>
+        <w:t xml:space="preserve"> </w:t>
+      </w:r>
+      <w:r>
+        <w:t xml:space="preserve">or</w:t>
+      </w:r>
+      <w:r>
+        <w:t xml:space="preserve"> </w:t>
+      </w:r>
+      <w:r>
+        <w:t xml:space="preserve">judgment</w:t>
+      </w:r>
+      <w:r>
+        <w:t xml:space="preserve"> </w:t>
+      </w:r>
+      <w:r>
+        <w:t xml:space="preserve">by</w:t>
+      </w:r>
+      <w:r>
+        <w:t xml:space="preserve"> </w:t>
+      </w:r>
+      <w:r>
+        <w:t xml:space="preserve">the</w:t>
+      </w:r>
+      <w:r>
+        <w:t xml:space="preserve"> </w:t>
+      </w:r>
+      <w:r>
+        <w:t xml:space="preserve">bankruptcy</w:t>
+      </w:r>
+      <w:r>
+        <w:t xml:space="preserve"> </w:t>
+      </w:r>
+      <w:r>
+        <w:t xml:space="preserve">court.</w:t>
       </w:r>
     </w:p>
-    <w:bookmarkEnd w:id="20"/>
-    <w:bookmarkStart w:id="21" w:name="X1a6eb564c57feffd2af79c4eda074b80d7825ef"/>
     <w:p>
       <w:pPr>
         <w:pStyle w:val="Heading1"/>
+        <w:keepNext/>
+        <w:keepLines/>
+        <w:spacing w:before="360" w:after="240" w:line="276" w:lineRule="exact"/>
+        <w:ind w:left="0" w:firstLine="0"/>
+        <w:jc w:val="center"/>
       </w:pPr>
       <w:r>
-        <w:t xml:space="preserve">II. FIRST CLAIM FOR RELIEF: NONDISCHARGEABILITY UNDER 11 U.S.C. § 523(a)(2)(A)</w:t>
+        <w:rPr>
+          <w:b/>
+          <w:bCs/>
+          <w:caps w:val="0"/>
+        </w:rPr>
+        <w:t xml:space="preserve">II.</w:t>
+      </w:r>
+      <w:r>
+        <w:rPr>
+          <w:b/>
+          <w:bCs/>
+          <w:caps w:val="0"/>
+        </w:rPr>
+        <w:t xml:space="preserve"> </w:t>
+      </w:r>
+      <w:r>
+        <w:rPr>
+          <w:b/>
+          <w:bCs/>
+          <w:caps w:val="0"/>
+        </w:rPr>
+        <w:t xml:space="preserve">FIRST</w:t>
+      </w:r>
+      <w:r>
+        <w:rPr>
+          <w:b/>
+          <w:bCs/>
+          <w:caps w:val="0"/>
+        </w:rPr>
+        <w:t xml:space="preserve"> </w:t>
+      </w:r>
+      <w:r>
+        <w:rPr>
+          <w:b/>
+          <w:bCs/>
+          <w:caps w:val="0"/>
+        </w:rPr>
+        <w:t xml:space="preserve">CLAIM</w:t>
+      </w:r>
+      <w:r>
+        <w:rPr>
+          <w:b/>
+          <w:bCs/>
+          <w:caps w:val="0"/>
+        </w:rPr>
+        <w:t xml:space="preserve"> </w:t>
+      </w:r>
+      <w:r>
+        <w:rPr>
+          <w:b/>
+          <w:bCs/>
+          <w:caps w:val="0"/>
+        </w:rPr>
+        <w:t xml:space="preserve">FOR</w:t>
+      </w:r>
+      <w:r>
+        <w:rPr>
+          <w:b/>
+          <w:bCs/>
+          <w:caps w:val="0"/>
+        </w:rPr>
+        <w:t xml:space="preserve"> </w:t>
+      </w:r>
+      <w:r>
+        <w:rPr>
+          <w:b/>
+          <w:bCs/>
+          <w:caps w:val="0"/>
+        </w:rPr>
+        <w:t xml:space="preserve">RELIEF:</w:t>
+      </w:r>
+      <w:r>
+        <w:rPr>
+          <w:b/>
+          <w:bCs/>
+          <w:caps w:val="0"/>
+        </w:rPr>
+        <w:t xml:space="preserve"> </w:t>
+      </w:r>
+      <w:r>
+        <w:rPr>
+          <w:b/>
+          <w:bCs/>
+          <w:caps w:val="0"/>
+        </w:rPr>
+        <w:t xml:space="preserve">NONDISCHARGEABILITY</w:t>
+      </w:r>
+      <w:r>
+        <w:rPr>
+          <w:b/>
+          <w:bCs/>
+          <w:caps w:val="0"/>
+        </w:rPr>
+        <w:t xml:space="preserve"> </w:t>
+      </w:r>
+      <w:r>
+        <w:rPr>
+          <w:b/>
+          <w:bCs/>
+          <w:caps w:val="0"/>
+        </w:rPr>
+        <w:t xml:space="preserve">UNDER</w:t>
+      </w:r>
+      <w:r>
+        <w:rPr>
+          <w:b/>
+          <w:bCs/>
+          <w:caps w:val="0"/>
+        </w:rPr>
+        <w:t xml:space="preserve"> </w:t>
+      </w:r>
+      <w:r>
+        <w:rPr>
+          <w:b/>
+          <w:bCs/>
+          <w:caps w:val="0"/>
+        </w:rPr>
+        <w:t xml:space="preserve">11</w:t>
+      </w:r>
+      <w:r>
+        <w:rPr>
+          <w:b/>
+          <w:bCs/>
+          <w:caps w:val="0"/>
+        </w:rPr>
+        <w:t xml:space="preserve"> </w:t>
+      </w:r>
+      <w:r>
+        <w:rPr>
+          <w:b/>
+          <w:bCs/>
+          <w:caps w:val="0"/>
+        </w:rPr>
+        <w:t xml:space="preserve">U.S.C.</w:t>
+      </w:r>
+      <w:r>
+        <w:rPr>
+          <w:b/>
+          <w:bCs/>
+          <w:caps w:val="0"/>
+        </w:rPr>
+        <w:t xml:space="preserve"> </w:t>
+      </w:r>
+      <w:r>
+        <w:rPr>
+          <w:b/>
+          <w:bCs/>
+          <w:caps w:val="0"/>
+        </w:rPr>
+        <w:t xml:space="preserve">§</w:t>
+      </w:r>
+      <w:r>
+        <w:rPr>
+          <w:b/>
+          <w:bCs/>
+          <w:caps w:val="0"/>
+        </w:rPr>
+        <w:t xml:space="preserve"> </w:t>
+      </w:r>
+      <w:r>
+        <w:rPr>
+          <w:b/>
+          <w:bCs/>
+          <w:caps w:val="0"/>
+        </w:rPr>
+        <w:t xml:space="preserve">523(a)⁠(2)⁠(A)</w:t>
       </w:r>
     </w:p>
     <w:p>
       <w:pPr>
-        <w:pStyle w:val="FirstParagraph"/>
+        <w:spacing w:before="240" w:after="240" w:line="276" w:lineRule="exact"/>
+        <w:ind w:left="720" w:hanging="720"/>
+        <w:jc w:val="left"/>
       </w:pPr>
       <w:r>
-        <w:t xml:space="preserve">6. Plaintiffs re-allege the preceding paragraphs.</w:t>
+        <w:t xml:space="preserve">6.</w:t>
+      </w:r>
+      <w:r>
+        <w:tab/>
+      </w:r>
+      <w:r>
+        <w:t xml:space="preserve">Plaintiffs</w:t>
+      </w:r>
+      <w:r>
+        <w:t xml:space="preserve"> </w:t>
+      </w:r>
+      <w:r>
+        <w:t xml:space="preserve">re-allege</w:t>
+      </w:r>
+      <w:r>
+        <w:t xml:space="preserve"> </w:t>
+      </w:r>
+      <w:r>
+        <w:t xml:space="preserve">the</w:t>
+      </w:r>
+      <w:r>
+        <w:t xml:space="preserve"> </w:t>
+      </w:r>
+      <w:r>
+        <w:t xml:space="preserve">preceding</w:t>
+      </w:r>
+      <w:r>
+        <w:t xml:space="preserve"> </w:t>
+      </w:r>
+      <w:r>
+        <w:t xml:space="preserve">paragraphs.</w:t>
       </w:r>
     </w:p>
     <w:p>
       <w:pPr>
-        <w:pStyle w:val="BodyText"/>
+        <w:spacing w:before="240" w:after="240" w:line="276" w:lineRule="exact"/>
+        <w:ind w:left="720" w:hanging="720"/>
+        <w:jc w:val="left"/>
       </w:pPr>
       <w:r>
-        <w:t xml:space="preserve">7. On or about March 3, 1999, Defendant One</w:t>
+        <w:t xml:space="preserve">7.</w:t>
+      </w:r>
+      <w:r>
+        <w:tab/>
+      </w:r>
+      <w:r>
+        <w:t xml:space="preserve">On</w:t>
+      </w:r>
+      <w:r>
+        <w:t xml:space="preserve"> </w:t>
+      </w:r>
+      <w:r>
+        <w:t xml:space="preserve">or</w:t>
+      </w:r>
+      <w:r>
+        <w:t xml:space="preserve"> </w:t>
+      </w:r>
+      <w:r>
+        <w:t xml:space="preserve">about</w:t>
+      </w:r>
+      <w:r>
+        <w:t xml:space="preserve"> </w:t>
+      </w:r>
+      <w:r>
+        <w:t xml:space="preserve">March</w:t>
+      </w:r>
+      <w:r>
+        <w:t xml:space="preserve"> </w:t>
+      </w:r>
+      <w:r>
+        <w:t xml:space="preserve">3,</w:t>
+      </w:r>
+      <w:r>
+        <w:t xml:space="preserve"> </w:t>
+      </w:r>
+      <w:r>
+        <w:t xml:space="preserve">1999,</w:t>
+      </w:r>
+      <w:r>
+        <w:t xml:space="preserve"> </w:t>
+      </w:r>
+      <w:r>
+        <w:t xml:space="preserve">Defendant</w:t>
+      </w:r>
+      <w:r>
+        <w:t xml:space="preserve"> </w:t>
+      </w:r>
+      <w:r>
+        <w:t xml:space="preserve">One</w:t>
       </w:r>
       <w:r>
         <w:t xml:space="preserve"> </w:t>
@@ -1116,247 +2331,1697 @@
           <w:i/>
           <w:iCs/>
         </w:rPr>
-        <w:t xml:space="preserve">represented in writing</w:t>
-      </w:r>
-      <w:r>
-        <w:t xml:space="preserve"> </w:t>
-      </w:r>
-      <w:r>
-        <w:t xml:space="preserve">that the household income stated on a loan application was accurate.</w:t>
+        <w:t xml:space="preserve">represented</w:t>
+      </w:r>
+      <w:r>
+        <w:rPr>
+          <w:i/>
+          <w:iCs/>
+        </w:rPr>
+        <w:t xml:space="preserve"> </w:t>
+      </w:r>
+      <w:r>
+        <w:rPr>
+          <w:i/>
+          <w:iCs/>
+        </w:rPr>
+        <w:t xml:space="preserve">in</w:t>
+      </w:r>
+      <w:r>
+        <w:rPr>
+          <w:i/>
+          <w:iCs/>
+        </w:rPr>
+        <w:t xml:space="preserve"> </w:t>
+      </w:r>
+      <w:r>
+        <w:rPr>
+          <w:i/>
+          <w:iCs/>
+        </w:rPr>
+        <w:t xml:space="preserve">writing</w:t>
+      </w:r>
+      <w:r>
+        <w:t xml:space="preserve"> </w:t>
+      </w:r>
+      <w:r>
+        <w:t xml:space="preserve">that</w:t>
+      </w:r>
+      <w:r>
+        <w:t xml:space="preserve"> </w:t>
+      </w:r>
+      <w:r>
+        <w:t xml:space="preserve">the</w:t>
+      </w:r>
+      <w:r>
+        <w:t xml:space="preserve"> </w:t>
+      </w:r>
+      <w:r>
+        <w:t xml:space="preserve">household</w:t>
+      </w:r>
+      <w:r>
+        <w:t xml:space="preserve"> </w:t>
+      </w:r>
+      <w:r>
+        <w:t xml:space="preserve">income</w:t>
+      </w:r>
+      <w:r>
+        <w:t xml:space="preserve"> </w:t>
+      </w:r>
+      <w:r>
+        <w:t xml:space="preserve">stated</w:t>
+      </w:r>
+      <w:r>
+        <w:t xml:space="preserve"> </w:t>
+      </w:r>
+      <w:r>
+        <w:t xml:space="preserve">on</w:t>
+      </w:r>
+      <w:r>
+        <w:t xml:space="preserve"> </w:t>
+      </w:r>
+      <w:r>
+        <w:t xml:space="preserve">a</w:t>
+      </w:r>
+      <w:r>
+        <w:t xml:space="preserve"> </w:t>
+      </w:r>
+      <w:r>
+        <w:t xml:space="preserve">loan</w:t>
+      </w:r>
+      <w:r>
+        <w:t xml:space="preserve"> </w:t>
+      </w:r>
+      <w:r>
+        <w:t xml:space="preserve">application</w:t>
+      </w:r>
+      <w:r>
+        <w:t xml:space="preserve"> </w:t>
+      </w:r>
+      <w:r>
+        <w:t xml:space="preserve">was</w:t>
+      </w:r>
+      <w:r>
+        <w:t xml:space="preserve"> </w:t>
+      </w:r>
+      <w:r>
+        <w:t xml:space="preserve">accurate.</w:t>
       </w:r>
     </w:p>
     <w:p>
       <w:pPr>
-        <w:pStyle w:val="BodyText"/>
+        <w:spacing w:before="240" w:after="240" w:line="276" w:lineRule="exact"/>
+        <w:ind w:left="720" w:hanging="720"/>
+        <w:jc w:val="left"/>
       </w:pPr>
       <w:r>
-        <w:t xml:space="preserve">8. The representation was false, and Defendant One knew it was false when it was made.</w:t>
+        <w:t xml:space="preserve">8.</w:t>
+      </w:r>
+      <w:r>
+        <w:tab/>
+      </w:r>
+      <w:r>
+        <w:t xml:space="preserve">The</w:t>
+      </w:r>
+      <w:r>
+        <w:t xml:space="preserve"> </w:t>
+      </w:r>
+      <w:r>
+        <w:t xml:space="preserve">representation</w:t>
+      </w:r>
+      <w:r>
+        <w:t xml:space="preserve"> </w:t>
+      </w:r>
+      <w:r>
+        <w:t xml:space="preserve">was</w:t>
+      </w:r>
+      <w:r>
+        <w:t xml:space="preserve"> </w:t>
+      </w:r>
+      <w:r>
+        <w:t xml:space="preserve">false,</w:t>
+      </w:r>
+      <w:r>
+        <w:t xml:space="preserve"> </w:t>
+      </w:r>
+      <w:r>
+        <w:t xml:space="preserve">and</w:t>
+      </w:r>
+      <w:r>
+        <w:t xml:space="preserve"> </w:t>
+      </w:r>
+      <w:r>
+        <w:t xml:space="preserve">Defendant</w:t>
+      </w:r>
+      <w:r>
+        <w:t xml:space="preserve"> </w:t>
+      </w:r>
+      <w:r>
+        <w:t xml:space="preserve">One</w:t>
+      </w:r>
+      <w:r>
+        <w:t xml:space="preserve"> </w:t>
+      </w:r>
+      <w:r>
+        <w:t xml:space="preserve">knew</w:t>
+      </w:r>
+      <w:r>
+        <w:t xml:space="preserve"> </w:t>
+      </w:r>
+      <w:r>
+        <w:t xml:space="preserve">it</w:t>
+      </w:r>
+      <w:r>
+        <w:t xml:space="preserve"> </w:t>
+      </w:r>
+      <w:r>
+        <w:t xml:space="preserve">was</w:t>
+      </w:r>
+      <w:r>
+        <w:t xml:space="preserve"> </w:t>
+      </w:r>
+      <w:r>
+        <w:t xml:space="preserve">false</w:t>
+      </w:r>
+      <w:r>
+        <w:t xml:space="preserve"> </w:t>
+      </w:r>
+      <w:r>
+        <w:t xml:space="preserve">when</w:t>
+      </w:r>
+      <w:r>
+        <w:t xml:space="preserve"> </w:t>
+      </w:r>
+      <w:r>
+        <w:t xml:space="preserve">it</w:t>
+      </w:r>
+      <w:r>
+        <w:t xml:space="preserve"> </w:t>
+      </w:r>
+      <w:r>
+        <w:t xml:space="preserve">was</w:t>
+      </w:r>
+      <w:r>
+        <w:t xml:space="preserve"> </w:t>
+      </w:r>
+      <w:r>
+        <w:t xml:space="preserve">made.</w:t>
       </w:r>
     </w:p>
     <w:p>
       <w:pPr>
-        <w:pStyle w:val="BodyText"/>
+        <w:spacing w:before="240" w:after="240" w:line="276" w:lineRule="exact"/>
+        <w:ind w:left="720" w:hanging="720"/>
+        <w:jc w:val="left"/>
       </w:pPr>
       <w:r>
-        <w:t xml:space="preserve">9. Plaintiffs relied on the representation when they made the loan.</w:t>
+        <w:t xml:space="preserve">9.</w:t>
+      </w:r>
+      <w:r>
+        <w:tab/>
+      </w:r>
+      <w:r>
+        <w:t xml:space="preserve">Plaintiffs</w:t>
+      </w:r>
+      <w:r>
+        <w:t xml:space="preserve"> </w:t>
+      </w:r>
+      <w:r>
+        <w:t xml:space="preserve">relied</w:t>
+      </w:r>
+      <w:r>
+        <w:t xml:space="preserve"> </w:t>
+      </w:r>
+      <w:r>
+        <w:t xml:space="preserve">on</w:t>
+      </w:r>
+      <w:r>
+        <w:t xml:space="preserve"> </w:t>
+      </w:r>
+      <w:r>
+        <w:t xml:space="preserve">the</w:t>
+      </w:r>
+      <w:r>
+        <w:t xml:space="preserve"> </w:t>
+      </w:r>
+      <w:r>
+        <w:t xml:space="preserve">representation</w:t>
+      </w:r>
+      <w:r>
+        <w:t xml:space="preserve"> </w:t>
+      </w:r>
+      <w:r>
+        <w:t xml:space="preserve">when</w:t>
+      </w:r>
+      <w:r>
+        <w:t xml:space="preserve"> </w:t>
+      </w:r>
+      <w:r>
+        <w:t xml:space="preserve">they</w:t>
+      </w:r>
+      <w:r>
+        <w:t xml:space="preserve"> </w:t>
+      </w:r>
+      <w:r>
+        <w:t xml:space="preserve">made</w:t>
+      </w:r>
+      <w:r>
+        <w:t xml:space="preserve"> </w:t>
+      </w:r>
+      <w:r>
+        <w:t xml:space="preserve">the</w:t>
+      </w:r>
+      <w:r>
+        <w:t xml:space="preserve"> </w:t>
+      </w:r>
+      <w:r>
+        <w:t xml:space="preserve">loan.</w:t>
       </w:r>
     </w:p>
     <w:p>
       <w:pPr>
-        <w:pStyle w:val="BodyText"/>
+        <w:spacing w:before="240" w:after="240" w:line="276" w:lineRule="exact"/>
+        <w:ind w:left="720" w:hanging="720"/>
+        <w:jc w:val="left"/>
       </w:pPr>
       <w:r>
-        <w:t xml:space="preserve">10. The loan balance owed to Plaintiffs on the petition date was $12,345.67.</w:t>
+        <w:t xml:space="preserve">10.</w:t>
+      </w:r>
+      <w:r>
+        <w:tab/>
+      </w:r>
+      <w:r>
+        <w:t xml:space="preserve">The</w:t>
+      </w:r>
+      <w:r>
+        <w:t xml:space="preserve"> </w:t>
+      </w:r>
+      <w:r>
+        <w:t xml:space="preserve">loan</w:t>
+      </w:r>
+      <w:r>
+        <w:t xml:space="preserve"> </w:t>
+      </w:r>
+      <w:r>
+        <w:t xml:space="preserve">balance</w:t>
+      </w:r>
+      <w:r>
+        <w:t xml:space="preserve"> </w:t>
+      </w:r>
+      <w:r>
+        <w:t xml:space="preserve">owed</w:t>
+      </w:r>
+      <w:r>
+        <w:t xml:space="preserve"> </w:t>
+      </w:r>
+      <w:r>
+        <w:t xml:space="preserve">to</w:t>
+      </w:r>
+      <w:r>
+        <w:t xml:space="preserve"> </w:t>
+      </w:r>
+      <w:r>
+        <w:t xml:space="preserve">Plaintiffs</w:t>
+      </w:r>
+      <w:r>
+        <w:t xml:space="preserve"> </w:t>
+      </w:r>
+      <w:r>
+        <w:t xml:space="preserve">on</w:t>
+      </w:r>
+      <w:r>
+        <w:t xml:space="preserve"> </w:t>
+      </w:r>
+      <w:r>
+        <w:t xml:space="preserve">the</w:t>
+      </w:r>
+      <w:r>
+        <w:t xml:space="preserve"> </w:t>
+      </w:r>
+      <w:r>
+        <w:t xml:space="preserve">petition</w:t>
+      </w:r>
+      <w:r>
+        <w:t xml:space="preserve"> </w:t>
+      </w:r>
+      <w:r>
+        <w:t xml:space="preserve">date</w:t>
+      </w:r>
+      <w:r>
+        <w:t xml:space="preserve"> </w:t>
+      </w:r>
+      <w:r>
+        <w:t xml:space="preserve">was</w:t>
+      </w:r>
+      <w:r>
+        <w:t xml:space="preserve"> </w:t>
+      </w:r>
+      <w:r>
+        <w:t xml:space="preserve">$12,345.67.</w:t>
       </w:r>
     </w:p>
     <w:p>
       <w:pPr>
-        <w:pStyle w:val="BodyText"/>
+        <w:spacing w:before="240" w:after="240" w:line="276" w:lineRule="exact"/>
+        <w:ind w:left="720" w:hanging="720"/>
+        <w:jc w:val="left"/>
       </w:pPr>
       <w:r>
-        <w:t xml:space="preserve">11. The debt is excepted from discharge under 11 U.S.C. § 523(a)(2)(A).</w:t>
+        <w:t xml:space="preserve">11.</w:t>
+      </w:r>
+      <w:r>
+        <w:tab/>
+      </w:r>
+      <w:r>
+        <w:t xml:space="preserve">The</w:t>
+      </w:r>
+      <w:r>
+        <w:t xml:space="preserve"> </w:t>
+      </w:r>
+      <w:r>
+        <w:t xml:space="preserve">debt</w:t>
+      </w:r>
+      <w:r>
+        <w:t xml:space="preserve"> </w:t>
+      </w:r>
+      <w:r>
+        <w:t xml:space="preserve">is</w:t>
+      </w:r>
+      <w:r>
+        <w:t xml:space="preserve"> </w:t>
+      </w:r>
+      <w:r>
+        <w:t xml:space="preserve">excepted</w:t>
+      </w:r>
+      <w:r>
+        <w:t xml:space="preserve"> </w:t>
+      </w:r>
+      <w:r>
+        <w:t xml:space="preserve">from</w:t>
+      </w:r>
+      <w:r>
+        <w:t xml:space="preserve"> </w:t>
+      </w:r>
+      <w:r>
+        <w:t xml:space="preserve">discharge</w:t>
+      </w:r>
+      <w:r>
+        <w:t xml:space="preserve"> </w:t>
+      </w:r>
+      <w:r>
+        <w:t xml:space="preserve">under</w:t>
+      </w:r>
+      <w:r>
+        <w:t xml:space="preserve"> </w:t>
+      </w:r>
+      <w:r>
+        <w:t xml:space="preserve">11</w:t>
+      </w:r>
+      <w:r>
+        <w:t xml:space="preserve"> </w:t>
+      </w:r>
+      <w:r>
+        <w:t xml:space="preserve">U.S.C.</w:t>
+      </w:r>
+      <w:r>
+        <w:t xml:space="preserve"> </w:t>
+      </w:r>
+      <w:r>
+        <w:t xml:space="preserve">§</w:t>
+      </w:r>
+      <w:r>
+        <w:t xml:space="preserve"> </w:t>
+      </w:r>
+      <w:r>
+        <w:t xml:space="preserve">523(a)⁠(2)⁠(A).</w:t>
       </w:r>
     </w:p>
-    <w:bookmarkEnd w:id="21"/>
-    <w:bookmarkStart w:id="22" w:name="Xb7bf7d30a8aae5a5856cb4c37185765651e3c44"/>
     <w:p>
       <w:pPr>
         <w:pStyle w:val="Heading1"/>
+        <w:keepNext/>
+        <w:keepLines/>
+        <w:spacing w:before="360" w:after="240" w:line="276" w:lineRule="exact"/>
+        <w:ind w:left="0" w:firstLine="0"/>
+        <w:jc w:val="center"/>
       </w:pPr>
       <w:r>
-        <w:t xml:space="preserve">III. SECOND CLAIM FOR RELIEF: NONDISCHARGEABILITY UNDER 11 U.S.C. § 523(a)(6)</w:t>
+        <w:rPr>
+          <w:b/>
+          <w:bCs/>
+          <w:caps w:val="0"/>
+        </w:rPr>
+        <w:t xml:space="preserve">III.</w:t>
+      </w:r>
+      <w:r>
+        <w:rPr>
+          <w:b/>
+          <w:bCs/>
+          <w:caps w:val="0"/>
+        </w:rPr>
+        <w:t xml:space="preserve"> </w:t>
+      </w:r>
+      <w:r>
+        <w:rPr>
+          <w:b/>
+          <w:bCs/>
+          <w:caps w:val="0"/>
+        </w:rPr>
+        <w:t xml:space="preserve">SECOND</w:t>
+      </w:r>
+      <w:r>
+        <w:rPr>
+          <w:b/>
+          <w:bCs/>
+          <w:caps w:val="0"/>
+        </w:rPr>
+        <w:t xml:space="preserve"> </w:t>
+      </w:r>
+      <w:r>
+        <w:rPr>
+          <w:b/>
+          <w:bCs/>
+          <w:caps w:val="0"/>
+        </w:rPr>
+        <w:t xml:space="preserve">CLAIM</w:t>
+      </w:r>
+      <w:r>
+        <w:rPr>
+          <w:b/>
+          <w:bCs/>
+          <w:caps w:val="0"/>
+        </w:rPr>
+        <w:t xml:space="preserve"> </w:t>
+      </w:r>
+      <w:r>
+        <w:rPr>
+          <w:b/>
+          <w:bCs/>
+          <w:caps w:val="0"/>
+        </w:rPr>
+        <w:t xml:space="preserve">FOR</w:t>
+      </w:r>
+      <w:r>
+        <w:rPr>
+          <w:b/>
+          <w:bCs/>
+          <w:caps w:val="0"/>
+        </w:rPr>
+        <w:t xml:space="preserve"> </w:t>
+      </w:r>
+      <w:r>
+        <w:rPr>
+          <w:b/>
+          <w:bCs/>
+          <w:caps w:val="0"/>
+        </w:rPr>
+        <w:t xml:space="preserve">RELIEF:</w:t>
+      </w:r>
+      <w:r>
+        <w:rPr>
+          <w:b/>
+          <w:bCs/>
+          <w:caps w:val="0"/>
+        </w:rPr>
+        <w:t xml:space="preserve"> </w:t>
+      </w:r>
+      <w:r>
+        <w:rPr>
+          <w:b/>
+          <w:bCs/>
+          <w:caps w:val="0"/>
+        </w:rPr>
+        <w:t xml:space="preserve">NONDISCHARGEABILITY</w:t>
+      </w:r>
+      <w:r>
+        <w:rPr>
+          <w:b/>
+          <w:bCs/>
+          <w:caps w:val="0"/>
+        </w:rPr>
+        <w:t xml:space="preserve"> </w:t>
+      </w:r>
+      <w:r>
+        <w:rPr>
+          <w:b/>
+          <w:bCs/>
+          <w:caps w:val="0"/>
+        </w:rPr>
+        <w:t xml:space="preserve">UNDER</w:t>
+      </w:r>
+      <w:r>
+        <w:rPr>
+          <w:b/>
+          <w:bCs/>
+          <w:caps w:val="0"/>
+        </w:rPr>
+        <w:t xml:space="preserve"> </w:t>
+      </w:r>
+      <w:r>
+        <w:rPr>
+          <w:b/>
+          <w:bCs/>
+          <w:caps w:val="0"/>
+        </w:rPr>
+        <w:t xml:space="preserve">11</w:t>
+      </w:r>
+      <w:r>
+        <w:rPr>
+          <w:b/>
+          <w:bCs/>
+          <w:caps w:val="0"/>
+        </w:rPr>
+        <w:t xml:space="preserve"> </w:t>
+      </w:r>
+      <w:r>
+        <w:rPr>
+          <w:b/>
+          <w:bCs/>
+          <w:caps w:val="0"/>
+        </w:rPr>
+        <w:t xml:space="preserve">U.S.C.</w:t>
+      </w:r>
+      <w:r>
+        <w:rPr>
+          <w:b/>
+          <w:bCs/>
+          <w:caps w:val="0"/>
+        </w:rPr>
+        <w:t xml:space="preserve"> </w:t>
+      </w:r>
+      <w:r>
+        <w:rPr>
+          <w:b/>
+          <w:bCs/>
+          <w:caps w:val="0"/>
+        </w:rPr>
+        <w:t xml:space="preserve">§</w:t>
+      </w:r>
+      <w:r>
+        <w:rPr>
+          <w:b/>
+          <w:bCs/>
+          <w:caps w:val="0"/>
+        </w:rPr>
+        <w:t xml:space="preserve"> </w:t>
+      </w:r>
+      <w:r>
+        <w:rPr>
+          <w:b/>
+          <w:bCs/>
+          <w:caps w:val="0"/>
+        </w:rPr>
+        <w:t xml:space="preserve">523(a)⁠(6)</w:t>
       </w:r>
     </w:p>
     <w:p>
       <w:pPr>
-        <w:pStyle w:val="FirstParagraph"/>
+        <w:spacing w:before="240" w:after="240" w:line="276" w:lineRule="exact"/>
+        <w:ind w:left="720" w:hanging="720"/>
+        <w:jc w:val="left"/>
       </w:pPr>
       <w:r>
-        <w:t xml:space="preserve">12. Plaintiffs re-allege the preceding paragraphs.</w:t>
+        <w:t xml:space="preserve">12.</w:t>
+      </w:r>
+      <w:r>
+        <w:tab/>
+      </w:r>
+      <w:r>
+        <w:t xml:space="preserve">Plaintiffs</w:t>
+      </w:r>
+      <w:r>
+        <w:t xml:space="preserve"> </w:t>
+      </w:r>
+      <w:r>
+        <w:t xml:space="preserve">re-allege</w:t>
+      </w:r>
+      <w:r>
+        <w:t xml:space="preserve"> </w:t>
+      </w:r>
+      <w:r>
+        <w:t xml:space="preserve">the</w:t>
+      </w:r>
+      <w:r>
+        <w:t xml:space="preserve"> </w:t>
+      </w:r>
+      <w:r>
+        <w:t xml:space="preserve">preceding</w:t>
+      </w:r>
+      <w:r>
+        <w:t xml:space="preserve"> </w:t>
+      </w:r>
+      <w:r>
+        <w:t xml:space="preserve">paragraphs.</w:t>
       </w:r>
     </w:p>
     <w:p>
       <w:pPr>
-        <w:pStyle w:val="BodyText"/>
+        <w:spacing w:before="240" w:after="240" w:line="276" w:lineRule="exact"/>
+        <w:ind w:left="720" w:hanging="720"/>
+        <w:jc w:val="left"/>
       </w:pPr>
       <w:r>
-        <w:t xml:space="preserve">13. On or about June 9, 1999, Defendant Two intentionally damaged the collateral securing the loan described above.</w:t>
+        <w:t xml:space="preserve">13.</w:t>
+      </w:r>
+      <w:r>
+        <w:tab/>
+      </w:r>
+      <w:r>
+        <w:t xml:space="preserve">On</w:t>
+      </w:r>
+      <w:r>
+        <w:t xml:space="preserve"> </w:t>
+      </w:r>
+      <w:r>
+        <w:t xml:space="preserve">or</w:t>
+      </w:r>
+      <w:r>
+        <w:t xml:space="preserve"> </w:t>
+      </w:r>
+      <w:r>
+        <w:t xml:space="preserve">about</w:t>
+      </w:r>
+      <w:r>
+        <w:t xml:space="preserve"> </w:t>
+      </w:r>
+      <w:r>
+        <w:t xml:space="preserve">June</w:t>
+      </w:r>
+      <w:r>
+        <w:t xml:space="preserve"> </w:t>
+      </w:r>
+      <w:r>
+        <w:t xml:space="preserve">9,</w:t>
+      </w:r>
+      <w:r>
+        <w:t xml:space="preserve"> </w:t>
+      </w:r>
+      <w:r>
+        <w:t xml:space="preserve">1999,</w:t>
+      </w:r>
+      <w:r>
+        <w:t xml:space="preserve"> </w:t>
+      </w:r>
+      <w:r>
+        <w:t xml:space="preserve">Defendant</w:t>
+      </w:r>
+      <w:r>
+        <w:t xml:space="preserve"> </w:t>
+      </w:r>
+      <w:r>
+        <w:t xml:space="preserve">Two</w:t>
+      </w:r>
+      <w:r>
+        <w:t xml:space="preserve"> </w:t>
+      </w:r>
+      <w:r>
+        <w:t xml:space="preserve">intentionally</w:t>
+      </w:r>
+      <w:r>
+        <w:t xml:space="preserve"> </w:t>
+      </w:r>
+      <w:r>
+        <w:t xml:space="preserve">damaged</w:t>
+      </w:r>
+      <w:r>
+        <w:t xml:space="preserve"> </w:t>
+      </w:r>
+      <w:r>
+        <w:t xml:space="preserve">the</w:t>
+      </w:r>
+      <w:r>
+        <w:t xml:space="preserve"> </w:t>
+      </w:r>
+      <w:r>
+        <w:t xml:space="preserve">collateral</w:t>
+      </w:r>
+      <w:r>
+        <w:t xml:space="preserve"> </w:t>
+      </w:r>
+      <w:r>
+        <w:t xml:space="preserve">securing</w:t>
+      </w:r>
+      <w:r>
+        <w:t xml:space="preserve"> </w:t>
+      </w:r>
+      <w:r>
+        <w:t xml:space="preserve">the</w:t>
+      </w:r>
+      <w:r>
+        <w:t xml:space="preserve"> </w:t>
+      </w:r>
+      <w:r>
+        <w:t xml:space="preserve">loan</w:t>
+      </w:r>
+      <w:r>
+        <w:t xml:space="preserve"> </w:t>
+      </w:r>
+      <w:r>
+        <w:t xml:space="preserve">described</w:t>
+      </w:r>
+      <w:r>
+        <w:t xml:space="preserve"> </w:t>
+      </w:r>
+      <w:r>
+        <w:t xml:space="preserve">above.</w:t>
       </w:r>
     </w:p>
     <w:p>
       <w:pPr>
-        <w:pStyle w:val="BodyText"/>
+        <w:spacing w:before="240" w:after="240" w:line="276" w:lineRule="exact"/>
+        <w:ind w:left="720" w:hanging="720"/>
+        <w:jc w:val="left"/>
       </w:pPr>
       <w:r>
-        <w:t xml:space="preserve">14. Defendant Two intended the damage and knew it would injure Plaintiffs’ interest in that collateral.</w:t>
+        <w:t xml:space="preserve">14.</w:t>
+      </w:r>
+      <w:r>
+        <w:tab/>
+      </w:r>
+      <w:r>
+        <w:t xml:space="preserve">Defendant</w:t>
+      </w:r>
+      <w:r>
+        <w:t xml:space="preserve"> </w:t>
+      </w:r>
+      <w:r>
+        <w:t xml:space="preserve">Two</w:t>
+      </w:r>
+      <w:r>
+        <w:t xml:space="preserve"> </w:t>
+      </w:r>
+      <w:r>
+        <w:t xml:space="preserve">intended</w:t>
+      </w:r>
+      <w:r>
+        <w:t xml:space="preserve"> </w:t>
+      </w:r>
+      <w:r>
+        <w:t xml:space="preserve">the</w:t>
+      </w:r>
+      <w:r>
+        <w:t xml:space="preserve"> </w:t>
+      </w:r>
+      <w:r>
+        <w:t xml:space="preserve">damage</w:t>
+      </w:r>
+      <w:r>
+        <w:t xml:space="preserve"> </w:t>
+      </w:r>
+      <w:r>
+        <w:t xml:space="preserve">and</w:t>
+      </w:r>
+      <w:r>
+        <w:t xml:space="preserve"> </w:t>
+      </w:r>
+      <w:r>
+        <w:t xml:space="preserve">knew</w:t>
+      </w:r>
+      <w:r>
+        <w:t xml:space="preserve"> </w:t>
+      </w:r>
+      <w:r>
+        <w:t xml:space="preserve">it</w:t>
+      </w:r>
+      <w:r>
+        <w:t xml:space="preserve"> </w:t>
+      </w:r>
+      <w:r>
+        <w:t xml:space="preserve">would</w:t>
+      </w:r>
+      <w:r>
+        <w:t xml:space="preserve"> </w:t>
+      </w:r>
+      <w:r>
+        <w:t xml:space="preserve">injure</w:t>
+      </w:r>
+      <w:r>
+        <w:t xml:space="preserve"> </w:t>
+      </w:r>
+      <w:r>
+        <w:t xml:space="preserve">Plaintiffs’</w:t>
+      </w:r>
+      <w:r>
+        <w:t xml:space="preserve"> </w:t>
+      </w:r>
+      <w:r>
+        <w:t xml:space="preserve">interest</w:t>
+      </w:r>
+      <w:r>
+        <w:t xml:space="preserve"> </w:t>
+      </w:r>
+      <w:r>
+        <w:t xml:space="preserve">in</w:t>
+      </w:r>
+      <w:r>
+        <w:t xml:space="preserve"> </w:t>
+      </w:r>
+      <w:r>
+        <w:t xml:space="preserve">that</w:t>
+      </w:r>
+      <w:r>
+        <w:t xml:space="preserve"> </w:t>
+      </w:r>
+      <w:r>
+        <w:t xml:space="preserve">collateral.</w:t>
       </w:r>
     </w:p>
     <w:p>
       <w:pPr>
-        <w:pStyle w:val="BodyText"/>
+        <w:spacing w:before="240" w:after="240" w:line="276" w:lineRule="exact"/>
+        <w:ind w:left="720" w:hanging="720"/>
+        <w:jc w:val="left"/>
       </w:pPr>
       <w:r>
-        <w:t xml:space="preserve">15. Plaintiffs were injured in the amount of $4,000.00.</w:t>
+        <w:t xml:space="preserve">15.</w:t>
+      </w:r>
+      <w:r>
+        <w:tab/>
+      </w:r>
+      <w:r>
+        <w:t xml:space="preserve">Plaintiffs</w:t>
+      </w:r>
+      <w:r>
+        <w:t xml:space="preserve"> </w:t>
+      </w:r>
+      <w:r>
+        <w:t xml:space="preserve">were</w:t>
+      </w:r>
+      <w:r>
+        <w:t xml:space="preserve"> </w:t>
+      </w:r>
+      <w:r>
+        <w:t xml:space="preserve">injured</w:t>
+      </w:r>
+      <w:r>
+        <w:t xml:space="preserve"> </w:t>
+      </w:r>
+      <w:r>
+        <w:t xml:space="preserve">in</w:t>
+      </w:r>
+      <w:r>
+        <w:t xml:space="preserve"> </w:t>
+      </w:r>
+      <w:r>
+        <w:t xml:space="preserve">the</w:t>
+      </w:r>
+      <w:r>
+        <w:t xml:space="preserve"> </w:t>
+      </w:r>
+      <w:r>
+        <w:t xml:space="preserve">amount</w:t>
+      </w:r>
+      <w:r>
+        <w:t xml:space="preserve"> </w:t>
+      </w:r>
+      <w:r>
+        <w:t xml:space="preserve">of</w:t>
+      </w:r>
+      <w:r>
+        <w:t xml:space="preserve"> </w:t>
+      </w:r>
+      <w:r>
+        <w:t xml:space="preserve">$4,000.00.</w:t>
       </w:r>
     </w:p>
     <w:p>
       <w:pPr>
-        <w:pStyle w:val="BodyText"/>
+        <w:spacing w:before="240" w:after="240" w:line="276" w:lineRule="exact"/>
+        <w:ind w:left="720" w:hanging="720"/>
+        <w:jc w:val="left"/>
       </w:pPr>
       <w:r>
-        <w:t xml:space="preserve">16. The debt is excepted from discharge under 11 U.S.C. § 523(a)(6).</w:t>
+        <w:t xml:space="preserve">16.</w:t>
+      </w:r>
+      <w:r>
+        <w:tab/>
+      </w:r>
+      <w:r>
+        <w:t xml:space="preserve">The</w:t>
+      </w:r>
+      <w:r>
+        <w:t xml:space="preserve"> </w:t>
+      </w:r>
+      <w:r>
+        <w:t xml:space="preserve">debt</w:t>
+      </w:r>
+      <w:r>
+        <w:t xml:space="preserve"> </w:t>
+      </w:r>
+      <w:r>
+        <w:t xml:space="preserve">is</w:t>
+      </w:r>
+      <w:r>
+        <w:t xml:space="preserve"> </w:t>
+      </w:r>
+      <w:r>
+        <w:t xml:space="preserve">excepted</w:t>
+      </w:r>
+      <w:r>
+        <w:t xml:space="preserve"> </w:t>
+      </w:r>
+      <w:r>
+        <w:t xml:space="preserve">from</w:t>
+      </w:r>
+      <w:r>
+        <w:t xml:space="preserve"> </w:t>
+      </w:r>
+      <w:r>
+        <w:t xml:space="preserve">discharge</w:t>
+      </w:r>
+      <w:r>
+        <w:t xml:space="preserve"> </w:t>
+      </w:r>
+      <w:r>
+        <w:t xml:space="preserve">under</w:t>
+      </w:r>
+      <w:r>
+        <w:t xml:space="preserve"> </w:t>
+      </w:r>
+      <w:r>
+        <w:t xml:space="preserve">11</w:t>
+      </w:r>
+      <w:r>
+        <w:t xml:space="preserve"> </w:t>
+      </w:r>
+      <w:r>
+        <w:t xml:space="preserve">U.S.C.</w:t>
+      </w:r>
+      <w:r>
+        <w:t xml:space="preserve"> </w:t>
+      </w:r>
+      <w:r>
+        <w:t xml:space="preserve">§</w:t>
+      </w:r>
+      <w:r>
+        <w:t xml:space="preserve"> </w:t>
+      </w:r>
+      <w:r>
+        <w:t xml:space="preserve">523(a)⁠(6).</w:t>
       </w:r>
     </w:p>
-    <w:bookmarkEnd w:id="22"/>
-    <w:bookmarkStart w:id="23" w:name="prayer-for-relief"/>
     <w:p>
       <w:pPr>
         <w:pStyle w:val="Heading1"/>
+        <w:keepNext/>
+        <w:keepLines/>
+        <w:spacing w:before="360" w:after="240" w:line="276" w:lineRule="exact"/>
+        <w:ind w:left="0" w:firstLine="0"/>
+        <w:jc w:val="center"/>
       </w:pPr>
       <w:r>
-        <w:t xml:space="preserve">PRAYER FOR RELIEF</w:t>
+        <w:rPr>
+          <w:b/>
+          <w:bCs/>
+          <w:caps w:val="0"/>
+        </w:rPr>
+        <w:t xml:space="preserve">PRAYER</w:t>
+      </w:r>
+      <w:r>
+        <w:rPr>
+          <w:b/>
+          <w:bCs/>
+          <w:caps w:val="0"/>
+        </w:rPr>
+        <w:t xml:space="preserve"> </w:t>
+      </w:r>
+      <w:r>
+        <w:rPr>
+          <w:b/>
+          <w:bCs/>
+          <w:caps w:val="0"/>
+        </w:rPr>
+        <w:t xml:space="preserve">FOR</w:t>
+      </w:r>
+      <w:r>
+        <w:rPr>
+          <w:b/>
+          <w:bCs/>
+          <w:caps w:val="0"/>
+        </w:rPr>
+        <w:t xml:space="preserve"> </w:t>
+      </w:r>
+      <w:r>
+        <w:rPr>
+          <w:b/>
+          <w:bCs/>
+          <w:caps w:val="0"/>
+        </w:rPr>
+        <w:t xml:space="preserve">RELIEF</w:t>
       </w:r>
     </w:p>
     <w:p>
       <w:pPr>
-        <w:pStyle w:val="FirstParagraph"/>
+        <w:spacing w:before="240" w:after="240" w:line="276" w:lineRule="exact"/>
+        <w:ind w:left="0" w:firstLine="720"/>
+        <w:jc w:val="left"/>
       </w:pPr>
       <w:r>
-        <w:t xml:space="preserve">WHEREFORE, Plaintiffs pray that the Court enter judgment as follows:</w:t>
+        <w:t xml:space="preserve">WHEREFORE,</w:t>
+      </w:r>
+      <w:r>
+        <w:t xml:space="preserve"> </w:t>
+      </w:r>
+      <w:r>
+        <w:t xml:space="preserve">Plaintiffs</w:t>
+      </w:r>
+      <w:r>
+        <w:t xml:space="preserve"> </w:t>
+      </w:r>
+      <w:r>
+        <w:t xml:space="preserve">pray</w:t>
+      </w:r>
+      <w:r>
+        <w:t xml:space="preserve"> </w:t>
+      </w:r>
+      <w:r>
+        <w:t xml:space="preserve">that</w:t>
+      </w:r>
+      <w:r>
+        <w:t xml:space="preserve"> </w:t>
+      </w:r>
+      <w:r>
+        <w:t xml:space="preserve">the</w:t>
+      </w:r>
+      <w:r>
+        <w:t xml:space="preserve"> </w:t>
+      </w:r>
+      <w:r>
+        <w:t xml:space="preserve">Court</w:t>
+      </w:r>
+      <w:r>
+        <w:t xml:space="preserve"> </w:t>
+      </w:r>
+      <w:r>
+        <w:t xml:space="preserve">enter</w:t>
+      </w:r>
+      <w:r>
+        <w:t xml:space="preserve"> </w:t>
+      </w:r>
+      <w:r>
+        <w:t xml:space="preserve">judgment</w:t>
+      </w:r>
+      <w:r>
+        <w:t xml:space="preserve"> </w:t>
+      </w:r>
+      <w:r>
+        <w:t xml:space="preserve">as</w:t>
+      </w:r>
+      <w:r>
+        <w:t xml:space="preserve"> </w:t>
+      </w:r>
+      <w:r>
+        <w:t xml:space="preserve">follows:</w:t>
       </w:r>
     </w:p>
     <w:p>
       <w:pPr>
-        <w:pStyle w:val="Compact"/>
-        <w:numPr>
-          <w:ilvl w:val="0"/>
-          <w:numId w:val="1001"/>
-        </w:numPr>
+        <w:spacing w:before="240" w:after="240" w:line="276" w:lineRule="exact"/>
+        <w:ind w:left="1440" w:hanging="720"/>
+        <w:jc w:val="left"/>
       </w:pPr>
       <w:r>
-        <w:t xml:space="preserve">Determining that the debt of Defendant One to Plaintiffs in the amount of $12,345.67 is excepted from discharge under 11 U.S.C. § 523(a)(2)(A);</w:t>
+        <w:t xml:space="preserve">1.</w:t>
+      </w:r>
+      <w:r>
+        <w:tab/>
+      </w:r>
+      <w:r>
+        <w:t xml:space="preserve">Determining</w:t>
+      </w:r>
+      <w:r>
+        <w:t xml:space="preserve"> </w:t>
+      </w:r>
+      <w:r>
+        <w:t xml:space="preserve">that</w:t>
+      </w:r>
+      <w:r>
+        <w:t xml:space="preserve"> </w:t>
+      </w:r>
+      <w:r>
+        <w:t xml:space="preserve">the</w:t>
+      </w:r>
+      <w:r>
+        <w:t xml:space="preserve"> </w:t>
+      </w:r>
+      <w:r>
+        <w:t xml:space="preserve">debt</w:t>
+      </w:r>
+      <w:r>
+        <w:t xml:space="preserve"> </w:t>
+      </w:r>
+      <w:r>
+        <w:t xml:space="preserve">of</w:t>
+      </w:r>
+      <w:r>
+        <w:t xml:space="preserve"> </w:t>
+      </w:r>
+      <w:r>
+        <w:t xml:space="preserve">Defendant</w:t>
+      </w:r>
+      <w:r>
+        <w:t xml:space="preserve"> </w:t>
+      </w:r>
+      <w:r>
+        <w:t xml:space="preserve">One</w:t>
+      </w:r>
+      <w:r>
+        <w:t xml:space="preserve"> </w:t>
+      </w:r>
+      <w:r>
+        <w:t xml:space="preserve">to</w:t>
+      </w:r>
+      <w:r>
+        <w:t xml:space="preserve"> </w:t>
+      </w:r>
+      <w:r>
+        <w:t xml:space="preserve">Plaintiffs</w:t>
+      </w:r>
+      <w:r>
+        <w:t xml:space="preserve"> </w:t>
+      </w:r>
+      <w:r>
+        <w:t xml:space="preserve">in</w:t>
+      </w:r>
+      <w:r>
+        <w:t xml:space="preserve"> </w:t>
+      </w:r>
+      <w:r>
+        <w:t xml:space="preserve">the</w:t>
+      </w:r>
+      <w:r>
+        <w:t xml:space="preserve"> </w:t>
+      </w:r>
+      <w:r>
+        <w:t xml:space="preserve">amount</w:t>
+      </w:r>
+      <w:r>
+        <w:t xml:space="preserve"> </w:t>
+      </w:r>
+      <w:r>
+        <w:t xml:space="preserve">of</w:t>
+      </w:r>
+      <w:r>
+        <w:t xml:space="preserve"> </w:t>
+      </w:r>
+      <w:r>
+        <w:t xml:space="preserve">$12,345.67</w:t>
+      </w:r>
+      <w:r>
+        <w:t xml:space="preserve"> </w:t>
+      </w:r>
+      <w:r>
+        <w:t xml:space="preserve">is</w:t>
+      </w:r>
+      <w:r>
+        <w:t xml:space="preserve"> </w:t>
+      </w:r>
+      <w:r>
+        <w:t xml:space="preserve">excepted</w:t>
+      </w:r>
+      <w:r>
+        <w:t xml:space="preserve"> </w:t>
+      </w:r>
+      <w:r>
+        <w:t xml:space="preserve">from</w:t>
+      </w:r>
+      <w:r>
+        <w:t xml:space="preserve"> </w:t>
+      </w:r>
+      <w:r>
+        <w:t xml:space="preserve">discharge</w:t>
+      </w:r>
+      <w:r>
+        <w:t xml:space="preserve"> </w:t>
+      </w:r>
+      <w:r>
+        <w:t xml:space="preserve">under</w:t>
+      </w:r>
+      <w:r>
+        <w:t xml:space="preserve"> </w:t>
+      </w:r>
+      <w:r>
+        <w:t xml:space="preserve">11</w:t>
+      </w:r>
+      <w:r>
+        <w:t xml:space="preserve"> </w:t>
+      </w:r>
+      <w:r>
+        <w:t xml:space="preserve">U.S.C.</w:t>
+      </w:r>
+      <w:r>
+        <w:t xml:space="preserve"> </w:t>
+      </w:r>
+      <w:r>
+        <w:t xml:space="preserve">§</w:t>
+      </w:r>
+      <w:r>
+        <w:t xml:space="preserve"> </w:t>
+      </w:r>
+      <w:r>
+        <w:t xml:space="preserve">523(a)⁠(2)⁠(A);</w:t>
       </w:r>
     </w:p>
     <w:p>
       <w:pPr>
-        <w:pStyle w:val="Compact"/>
-        <w:numPr>
-          <w:ilvl w:val="0"/>
-          <w:numId w:val="1001"/>
-        </w:numPr>
+        <w:spacing w:before="240" w:after="240" w:line="276" w:lineRule="exact"/>
+        <w:ind w:left="1440" w:hanging="720"/>
+        <w:jc w:val="left"/>
       </w:pPr>
       <w:r>
-        <w:t xml:space="preserve">Determining that the debt of Defendant Two to Plaintiffs in the amount of $4,000.00 is excepted from discharge under 11 U.S.C. § 523(a)(6);</w:t>
+        <w:t xml:space="preserve">2.</w:t>
+      </w:r>
+      <w:r>
+        <w:tab/>
+      </w:r>
+      <w:r>
+        <w:t xml:space="preserve">Determining</w:t>
+      </w:r>
+      <w:r>
+        <w:t xml:space="preserve"> </w:t>
+      </w:r>
+      <w:r>
+        <w:t xml:space="preserve">that</w:t>
+      </w:r>
+      <w:r>
+        <w:t xml:space="preserve"> </w:t>
+      </w:r>
+      <w:r>
+        <w:t xml:space="preserve">the</w:t>
+      </w:r>
+      <w:r>
+        <w:t xml:space="preserve"> </w:t>
+      </w:r>
+      <w:r>
+        <w:t xml:space="preserve">debt</w:t>
+      </w:r>
+      <w:r>
+        <w:t xml:space="preserve"> </w:t>
+      </w:r>
+      <w:r>
+        <w:t xml:space="preserve">of</w:t>
+      </w:r>
+      <w:r>
+        <w:t xml:space="preserve"> </w:t>
+      </w:r>
+      <w:r>
+        <w:t xml:space="preserve">Defendant</w:t>
+      </w:r>
+      <w:r>
+        <w:t xml:space="preserve"> </w:t>
+      </w:r>
+      <w:r>
+        <w:t xml:space="preserve">Two</w:t>
+      </w:r>
+      <w:r>
+        <w:t xml:space="preserve"> </w:t>
+      </w:r>
+      <w:r>
+        <w:t xml:space="preserve">to</w:t>
+      </w:r>
+      <w:r>
+        <w:t xml:space="preserve"> </w:t>
+      </w:r>
+      <w:r>
+        <w:t xml:space="preserve">Plaintiffs</w:t>
+      </w:r>
+      <w:r>
+        <w:t xml:space="preserve"> </w:t>
+      </w:r>
+      <w:r>
+        <w:t xml:space="preserve">in</w:t>
+      </w:r>
+      <w:r>
+        <w:t xml:space="preserve"> </w:t>
+      </w:r>
+      <w:r>
+        <w:t xml:space="preserve">the</w:t>
+      </w:r>
+      <w:r>
+        <w:t xml:space="preserve"> </w:t>
+      </w:r>
+      <w:r>
+        <w:t xml:space="preserve">amount</w:t>
+      </w:r>
+      <w:r>
+        <w:t xml:space="preserve"> </w:t>
+      </w:r>
+      <w:r>
+        <w:t xml:space="preserve">of</w:t>
+      </w:r>
+      <w:r>
+        <w:t xml:space="preserve"> </w:t>
+      </w:r>
+      <w:r>
+        <w:t xml:space="preserve">$4,000.00</w:t>
+      </w:r>
+      <w:r>
+        <w:t xml:space="preserve"> </w:t>
+      </w:r>
+      <w:r>
+        <w:t xml:space="preserve">is</w:t>
+      </w:r>
+      <w:r>
+        <w:t xml:space="preserve"> </w:t>
+      </w:r>
+      <w:r>
+        <w:t xml:space="preserve">excepted</w:t>
+      </w:r>
+      <w:r>
+        <w:t xml:space="preserve"> </w:t>
+      </w:r>
+      <w:r>
+        <w:t xml:space="preserve">from</w:t>
+      </w:r>
+      <w:r>
+        <w:t xml:space="preserve"> </w:t>
+      </w:r>
+      <w:r>
+        <w:t xml:space="preserve">discharge</w:t>
+      </w:r>
+      <w:r>
+        <w:t xml:space="preserve"> </w:t>
+      </w:r>
+      <w:r>
+        <w:t xml:space="preserve">under</w:t>
+      </w:r>
+      <w:r>
+        <w:t xml:space="preserve"> </w:t>
+      </w:r>
+      <w:r>
+        <w:t xml:space="preserve">11</w:t>
+      </w:r>
+      <w:r>
+        <w:t xml:space="preserve"> </w:t>
+      </w:r>
+      <w:r>
+        <w:t xml:space="preserve">U.S.C.</w:t>
+      </w:r>
+      <w:r>
+        <w:t xml:space="preserve"> </w:t>
+      </w:r>
+      <w:r>
+        <w:t xml:space="preserve">§</w:t>
+      </w:r>
+      <w:r>
+        <w:t xml:space="preserve"> </w:t>
+      </w:r>
+      <w:r>
+        <w:t xml:space="preserve">523(a)⁠(6);</w:t>
       </w:r>
     </w:p>
     <w:p>
       <w:pPr>
-        <w:pStyle w:val="Compact"/>
-        <w:numPr>
-          <w:ilvl w:val="0"/>
-          <w:numId w:val="1001"/>
-        </w:numPr>
+        <w:spacing w:before="240" w:after="240" w:line="276" w:lineRule="exact"/>
+        <w:ind w:left="1440" w:hanging="720"/>
+        <w:jc w:val="left"/>
       </w:pPr>
       <w:r>
-        <w:t xml:space="preserve">Awarding Plaintiffs their costs of suit; and</w:t>
-      </w:r>
-    </w:p>
-    <w:p>
-      <w:pPr>
-        <w:pStyle w:val="Compact"/>
-        <w:numPr>
-          <w:ilvl w:val="0"/>
-          <w:numId w:val="1001"/>
-        </w:numPr>
-      </w:pPr>
-      <w:r>
-        <w:t xml:space="preserve">Granting such further relief as the Court deems just.</w:t>
+        <w:t xml:space="preserve">3.</w:t>
+      </w:r>
+      <w:r>
+        <w:tab/>
+      </w:r>
+      <w:r>
+        <w:t xml:space="preserve">Awarding</w:t>
+      </w:r>
+      <w:r>
+        <w:t xml:space="preserve"> </w:t>
+      </w:r>
+      <w:r>
+        <w:t xml:space="preserve">Plaintiffs</w:t>
+      </w:r>
+      <w:r>
+        <w:t xml:space="preserve"> </w:t>
+      </w:r>
+      <w:r>
+        <w:t xml:space="preserve">their</w:t>
+      </w:r>
+      <w:r>
+        <w:t xml:space="preserve"> </w:t>
+      </w:r>
+      <w:r>
+        <w:t xml:space="preserve">costs</w:t>
+      </w:r>
+      <w:r>
+        <w:t xml:space="preserve"> </w:t>
+      </w:r>
+      <w:r>
+        <w:t xml:space="preserve">of</w:t>
+      </w:r>
+      <w:r>
+        <w:t xml:space="preserve"> </w:t>
+      </w:r>
+      <w:r>
+        <w:t xml:space="preserve">suit;</w:t>
+      </w:r>
+      <w:r>
+        <w:t xml:space="preserve"> </w:t>
+      </w:r>
+      <w:r>
+        <w:t xml:space="preserve">and</w:t>
       </w:r>
     </w:p>
     <w:p>
       <w:pPr>
         <w:keepNext/>
-        <w:spacing w:before="360" w:after="0" w:line="276" w:lineRule="exact"/>
-        <w:ind w:left="0" w:firstLine="0"/>
+        <w:keepLines/>
+        <w:spacing w:before="240" w:after="240" w:line="276" w:lineRule="exact"/>
+        <w:ind w:left="1440" w:hanging="720"/>
+        <w:jc w:val="left"/>
       </w:pPr>
       <w:r>
-        <w:t xml:space="preserve">DATED </w:t>
-      </w:r>
-      <w:r>
-        <w:t xml:space="preserve">January 1, 2001</w:t>
-      </w:r>
-      <w:r>
-        <w:t xml:space="preserve">.</w:t>
+        <w:t xml:space="preserve">4.</w:t>
+      </w:r>
+      <w:r>
+        <w:tab/>
+      </w:r>
+      <w:r>
+        <w:t xml:space="preserve">Granting</w:t>
+      </w:r>
+      <w:r>
+        <w:t xml:space="preserve"> </w:t>
+      </w:r>
+      <w:r>
+        <w:t xml:space="preserve">such</w:t>
+      </w:r>
+      <w:r>
+        <w:t xml:space="preserve"> </w:t>
+      </w:r>
+      <w:r>
+        <w:t xml:space="preserve">further</w:t>
+      </w:r>
+      <w:r>
+        <w:t xml:space="preserve"> </w:t>
+      </w:r>
+      <w:r>
+        <w:t xml:space="preserve">relief</w:t>
+      </w:r>
+      <w:r>
+        <w:t xml:space="preserve"> </w:t>
+      </w:r>
+      <w:r>
+        <w:t xml:space="preserve">as</w:t>
+      </w:r>
+      <w:r>
+        <w:t xml:space="preserve"> </w:t>
+      </w:r>
+      <w:r>
+        <w:t xml:space="preserve">the</w:t>
+      </w:r>
+      <w:r>
+        <w:t xml:space="preserve"> </w:t>
+      </w:r>
+      <w:r>
+        <w:t xml:space="preserve">Court</w:t>
+      </w:r>
+      <w:r>
+        <w:t xml:space="preserve"> </w:t>
+      </w:r>
+      <w:r>
+        <w:t xml:space="preserve">deems</w:t>
+      </w:r>
+      <w:r>
+        <w:t xml:space="preserve"> </w:t>
+      </w:r>
+      <w:r>
+        <w:t xml:space="preserve">just.</w:t>
       </w:r>
     </w:p>
     <w:p>
       <w:pPr>
         <w:keepNext/>
+        <w:keepLines/>
         <w:spacing w:before="360" w:after="0" w:line="276" w:lineRule="exact"/>
-        <w:ind w:left="4680" w:firstLine="0"/>
+        <w:ind w:left="0" w:firstLine="0"/>
+        <w:jc w:val="left"/>
       </w:pPr>
       <w:r>
-        <w:t xml:space="preserve">/s/ </w:t>
-      </w:r>
-      <w:r>
-        <w:t xml:space="preserve">Example Counsel</w:t>
+        <w:t xml:space="preserve">DATED </w:t>
+      </w:r>
+      <w:r>
+        <w:t xml:space="preserve">January</w:t>
+      </w:r>
+      <w:r>
+        <w:t xml:space="preserve"> </w:t>
+      </w:r>
+      <w:r>
+        <w:t xml:space="preserve">1,</w:t>
+      </w:r>
+      <w:r>
+        <w:t xml:space="preserve"> </w:t>
+      </w:r>
+      <w:r>
+        <w:t xml:space="preserve">2001</w:t>
+      </w:r>
+      <w:r>
+        <w:t xml:space="preserve">.</w:t>
       </w:r>
     </w:p>
     <w:p>
       <w:pPr>
         <w:keepNext/>
-        <w:spacing w:before="0" w:after="0" w:line="276" w:lineRule="exact"/>
+        <w:keepLines/>
+        <w:spacing w:before="360" w:after="0" w:line="276" w:lineRule="exact"/>
         <w:ind w:left="4680" w:firstLine="0"/>
+        <w:jc w:val="left"/>
       </w:pPr>
       <w:r>
-        <w:t xml:space="preserve">Example Counsel</w:t>
+        <w:t xml:space="preserve">/s/ </w:t>
+      </w:r>
+      <w:r>
+        <w:t xml:space="preserve">Example</w:t>
+      </w:r>
+      <w:r>
+        <w:t xml:space="preserve"> </w:t>
+      </w:r>
+      <w:r>
+        <w:t xml:space="preserve">Counsel</w:t>
       </w:r>
     </w:p>
     <w:p>
       <w:pPr>
         <w:keepNext/>
+        <w:keepLines/>
         <w:spacing w:before="0" w:after="0" w:line="276" w:lineRule="exact"/>
         <w:ind w:left="4680" w:firstLine="0"/>
+        <w:jc w:val="left"/>
       </w:pPr>
       <w:r>
-        <w:t xml:space="preserve">Example Law Office</w:t>
+        <w:t xml:space="preserve">Example</w:t>
+      </w:r>
+      <w:r>
+        <w:t xml:space="preserve"> </w:t>
+      </w:r>
+      <w:r>
+        <w:t xml:space="preserve">Counsel</w:t>
       </w:r>
     </w:p>
     <w:p>
       <w:pPr>
         <w:keepNext/>
+        <w:keepLines/>
         <w:spacing w:before="0" w:after="0" w:line="276" w:lineRule="exact"/>
         <w:ind w:left="4680" w:firstLine="0"/>
+        <w:jc w:val="left"/>
       </w:pPr>
       <w:r>
-        <w:t xml:space="preserve">100 Example Street</w:t>
+        <w:t xml:space="preserve">Example</w:t>
+      </w:r>
+      <w:r>
+        <w:t xml:space="preserve"> </w:t>
+      </w:r>
+      <w:r>
+        <w:t xml:space="preserve">Law</w:t>
+      </w:r>
+      <w:r>
+        <w:t xml:space="preserve"> </w:t>
+      </w:r>
+      <w:r>
+        <w:t xml:space="preserve">Office</w:t>
       </w:r>
     </w:p>
     <w:p>
       <w:pPr>
         <w:keepNext/>
+        <w:keepLines/>
         <w:spacing w:before="0" w:after="0" w:line="276" w:lineRule="exact"/>
         <w:ind w:left="4680" w:firstLine="0"/>
+        <w:jc w:val="left"/>
       </w:pPr>
       <w:r>
-        <w:t xml:space="preserve">Sioux Falls, SD 57101</w:t>
+        <w:t xml:space="preserve">100</w:t>
+      </w:r>
+      <w:r>
+        <w:t xml:space="preserve"> </w:t>
+      </w:r>
+      <w:r>
+        <w:t xml:space="preserve">Example</w:t>
+      </w:r>
+      <w:r>
+        <w:t xml:space="preserve"> </w:t>
+      </w:r>
+      <w:r>
+        <w:t xml:space="preserve">Street</w:t>
       </w:r>
     </w:p>
     <w:p>
       <w:pPr>
         <w:keepNext/>
+        <w:keepLines/>
         <w:spacing w:before="0" w:after="0" w:line="276" w:lineRule="exact"/>
         <w:ind w:left="4680" w:firstLine="0"/>
+        <w:jc w:val="left"/>
       </w:pPr>
       <w:r>
-        <w:t xml:space="preserve">(605) 000-0000</w:t>
+        <w:t xml:space="preserve">Sioux</w:t>
+      </w:r>
+      <w:r>
+        <w:t xml:space="preserve"> </w:t>
+      </w:r>
+      <w:r>
+        <w:t xml:space="preserve">Falls,</w:t>
+      </w:r>
+      <w:r>
+        <w:t xml:space="preserve"> </w:t>
+      </w:r>
+      <w:r>
+        <w:t xml:space="preserve">SD</w:t>
+      </w:r>
+      <w:r>
+        <w:t xml:space="preserve"> </w:t>
+      </w:r>
+      <w:r>
+        <w:t xml:space="preserve">57101</w:t>
       </w:r>
     </w:p>
     <w:p>
       <w:pPr>
         <w:keepNext/>
+        <w:keepLines/>
         <w:spacing w:before="0" w:after="0" w:line="276" w:lineRule="exact"/>
         <w:ind w:left="4680" w:firstLine="0"/>
+        <w:jc w:val="left"/>
+      </w:pPr>
+      <w:r>
+        <w:t xml:space="preserve">(605)</w:t>
+      </w:r>
+      <w:r>
+        <w:t xml:space="preserve"> </w:t>
+      </w:r>
+      <w:r>
+        <w:t xml:space="preserve">000</w:t>
+        <w:noBreakHyphen/>
+        <w:t xml:space="preserve">0000</w:t>
+      </w:r>
+    </w:p>
+    <w:p>
+      <w:pPr>
+        <w:keepNext/>
+        <w:keepLines/>
+        <w:spacing w:before="0" w:after="0" w:line="276" w:lineRule="exact"/>
+        <w:ind w:left="4680" w:firstLine="0"/>
+        <w:jc w:val="left"/>
       </w:pPr>
       <w:r>
         <w:t xml:space="preserve">counsel@example.invalid</w:t>
@@ -1366,19 +4031,28 @@
       <w:pPr>
         <w:spacing w:before="0" w:after="0" w:line="276" w:lineRule="exact"/>
         <w:ind w:left="4680" w:firstLine="0"/>
+        <w:jc w:val="left"/>
       </w:pPr>
       <w:r>
-        <w:t xml:space="preserve">Attorneys for Plaintiffs</w:t>
+        <w:t xml:space="preserve">Attorneys</w:t>
+      </w:r>
+      <w:r>
+        <w:t xml:space="preserve"> </w:t>
+      </w:r>
+      <w:r>
+        <w:t xml:space="preserve">for</w:t>
+      </w:r>
+      <w:r>
+        <w:t xml:space="preserve"> </w:t>
+      </w:r>
+      <w:r>
+        <w:t xml:space="preserve">Plaintiffs</w:t>
       </w:r>
     </w:p>
-    <w:bookmarkEnd w:id="23"/>
     <w:sectPr>
-      <w:footerReference r:id="rId9" w:type="default"/>
-      <w:footnotePr>
-        <w:numRestart w:val="eachSect"/>
-      </w:footnotePr>
-      <w:pgSz w:h="15840" w:w="12240"/>
-      <w:pgMar w:bottom="1440" w:footer="720" w:gutter="0" w:header="720" w:left="1440" w:right="1440" w:top="1440"/>
+      <w:footerReference w:type="default" r:id="rIdFooter1"/>
+      <w:pgSz w:w="12240" w:h="15840"/>
+      <w:pgMar w:top="1440" w:right="1440" w:bottom="1440" w:left="1440" w:header="720" w:footer="735" w:gutter="0"/>
     </w:sectPr>
   </w:body>
 </w:document>
@@ -1392,18 +4066,23 @@
 <w:ftr xmlns:w="http://schemas.openxmlformats.org/wordprocessingml/2006/main" xmlns:r="http://schemas.openxmlformats.org/officeDocument/2006/relationships">
   <w:p>
     <w:pPr>
-      <w:pStyle w:val="Footer"/>
       <w:jc w:val="center"/>
     </w:pPr>
-    <w:fldSimple w:instr=" PAGE ">
-      <w:r>
-        <w:rPr>
-          <w:sz w:val="20"/>
-          <w:szCs w:val="20"/>
-        </w:rPr>
-        <w:t>1</w:t>
-      </w:r>
-    </w:fldSimple>
+    <w:r>
+      <w:fldChar w:fldCharType="begin"/>
+    </w:r>
+    <w:r>
+      <w:instrText xml:space="preserve"> PAGE </w:instrText>
+    </w:r>
+    <w:r>
+      <w:fldChar w:fldCharType="separate"/>
+    </w:r>
+    <w:r>
+      <w:t>1</w:t>
+    </w:r>
+    <w:r>
+      <w:fldChar w:fldCharType="end"/>
+    </w:r>
   </w:p>
 </w:ftr>
 </file>
@@ -1505,311 +4184,705 @@
       </w:pPr>
     </w:lvl>
   </w:abstractNum>
-  <w:abstractNum w:abstractNumId="99411">
-    <w:nsid w:val="00A99411"/>
-    <w:multiLevelType w:val="multilevel"/>
-    <w:lvl w:ilvl="0">
-      <w:start w:val="1"/>
-      <w:numFmt w:val="decimal"/>
-      <w:lvlText w:val="%1."/>
-      <w:lvlJc w:val="left"/>
-      <w:pPr>
-        <w:ind w:left="720" w:hanging="360"/>
-      </w:pPr>
-    </w:lvl>
-    <w:lvl w:ilvl="1">
-      <w:start w:val="1"/>
-      <w:numFmt w:val="decimal"/>
-      <w:lvlText w:val="%2."/>
-      <w:lvlJc w:val="left"/>
-      <w:pPr>
-        <w:ind w:left="1440" w:hanging="360"/>
-      </w:pPr>
-    </w:lvl>
-    <w:lvl w:ilvl="2">
-      <w:start w:val="1"/>
-      <w:numFmt w:val="decimal"/>
-      <w:lvlText w:val="%3."/>
-      <w:lvlJc w:val="left"/>
-      <w:pPr>
-        <w:ind w:left="2160" w:hanging="360"/>
-      </w:pPr>
-    </w:lvl>
-    <w:lvl w:ilvl="3">
-      <w:start w:val="1"/>
-      <w:numFmt w:val="decimal"/>
-      <w:lvlText w:val="%4."/>
-      <w:lvlJc w:val="left"/>
-      <w:pPr>
-        <w:ind w:left="2880" w:hanging="360"/>
-      </w:pPr>
-    </w:lvl>
-    <w:lvl w:ilvl="4">
-      <w:start w:val="1"/>
-      <w:numFmt w:val="decimal"/>
-      <w:lvlText w:val="%5."/>
-      <w:lvlJc w:val="left"/>
-      <w:pPr>
-        <w:ind w:left="3600" w:hanging="360"/>
-      </w:pPr>
-    </w:lvl>
-    <w:lvl w:ilvl="5">
-      <w:start w:val="1"/>
-      <w:numFmt w:val="decimal"/>
-      <w:lvlText w:val="%6."/>
-      <w:lvlJc w:val="left"/>
-      <w:pPr>
-        <w:ind w:left="4320" w:hanging="360"/>
-      </w:pPr>
-    </w:lvl>
-    <w:lvl w:ilvl="6">
-      <w:start w:val="1"/>
-      <w:numFmt w:val="decimal"/>
-      <w:lvlText w:val="%7."/>
-      <w:lvlJc w:val="left"/>
-      <w:pPr>
-        <w:ind w:left="5040" w:hanging="360"/>
-      </w:pPr>
-    </w:lvl>
-    <w:lvl w:ilvl="7">
-      <w:start w:val="1"/>
-      <w:numFmt w:val="decimal"/>
-      <w:lvlText w:val="%8."/>
-      <w:lvlJc w:val="left"/>
-      <w:pPr>
-        <w:ind w:left="5760" w:hanging="360"/>
-      </w:pPr>
-    </w:lvl>
-    <w:lvl w:ilvl="8">
-      <w:start w:val="1"/>
-      <w:numFmt w:val="decimal"/>
-      <w:lvlText w:val="%9."/>
-      <w:lvlJc w:val="left"/>
-      <w:pPr>
-        <w:ind w:left="6480" w:hanging="360"/>
-      </w:pPr>
-    </w:lvl>
-  </w:abstractNum>
   <w:num w:numId="1000">
     <w:abstractNumId w:val="990"/>
-  </w:num>
-  <w:num w:numId="1001">
-    <w:abstractNumId w:val="99411"/>
-    <w:lvlOverride w:ilvl="0">
-      <w:startOverride w:val="1"/>
-    </w:lvlOverride>
-    <w:lvlOverride w:ilvl="1">
-      <w:startOverride w:val="1"/>
-    </w:lvlOverride>
-    <w:lvlOverride w:ilvl="2">
-      <w:startOverride w:val="1"/>
-    </w:lvlOverride>
-    <w:lvlOverride w:ilvl="3">
-      <w:startOverride w:val="1"/>
-    </w:lvlOverride>
-    <w:lvlOverride w:ilvl="4">
-      <w:startOverride w:val="1"/>
-    </w:lvlOverride>
-    <w:lvlOverride w:ilvl="5">
-      <w:startOverride w:val="1"/>
-    </w:lvlOverride>
-    <w:lvlOverride w:ilvl="6">
-      <w:startOverride w:val="1"/>
-    </w:lvlOverride>
-    <w:lvlOverride w:ilvl="7">
-      <w:startOverride w:val="1"/>
-    </w:lvlOverride>
-    <w:lvlOverride w:ilvl="8">
-      <w:startOverride w:val="1"/>
-    </w:lvlOverride>
   </w:num>
 </w:numbering>
 </file>
 
 <file path=word/styles.xml><?xml version="1.0" encoding="utf-8"?>
-<w:styles xmlns:w="http://schemas.openxmlformats.org/wordprocessingml/2006/main">
+<w:styles xmlns:r="http://schemas.openxmlformats.org/officeDocument/2006/relationships" xmlns:w="http://schemas.openxmlformats.org/wordprocessingml/2006/main">
   <w:docDefaults>
     <w:rPrDefault>
       <w:rPr>
-        <w:rFonts w:ascii="EB Garamond" w:cs="EB Garamond" w:eastAsia="EB Garamond" w:hAnsi="EB Garamond"/>
-        <w:color w:val="000000"/>
+        <w:rFonts w:ascii="Times New Roman" w:hAnsi="Times New Roman" w:eastAsia="Times New Roman" w:cs="Times New Roman"/>
         <w:sz w:val="24"/>
         <w:szCs w:val="24"/>
-        <w:lang w:bidi="ar-SA" w:eastAsia="en-US" w:val="en-US"/>
+        <w:lang w:val="en-US" w:eastAsia="zh-CN" w:bidi="ar-SA"/>
       </w:rPr>
     </w:rPrDefault>
     <w:pPrDefault>
       <w:pPr>
-        <w:spacing w:after="0" w:before="0" w:line="276" w:lineRule="exact"/>
+        <w:widowControl/>
+        <w:spacing w:after="0"/>
       </w:pPr>
     </w:pPrDefault>
   </w:docDefaults>
-  <w:style w:default="1" w:styleId="Normal" w:type="paragraph">
+  <w:latentStyles w:defLockedState="0" w:defUIPriority="0" w:defSemiHidden="0" w:defUnhideWhenUsed="0" w:defQFormat="0" w:count="276"/>
+  <w:style w:type="paragraph" w:default="1" w:styleId="Normal">
     <w:name w:val="Normal"/>
     <w:qFormat/>
   </w:style>
-  <w:style w:default="1" w:styleId="DefaultParagraphFont" w:type="character">
-    <w:name w:val="Default Paragraph Font"/>
-    <w:uiPriority w:val="1"/>
-    <w:semiHidden/>
-    <w:unhideWhenUsed/>
-  </w:style>
-  <w:style w:default="1" w:styleId="TableNormal" w:type="table">
-    <w:name w:val="Normal Table"/>
-    <w:uiPriority w:val="99"/>
-    <w:semiHidden/>
-    <w:unhideWhenUsed/>
-    <w:tblPr>
-      <w:tblInd w:type="dxa" w:w="0"/>
-      <w:tblCellMar>
-        <w:top w:type="dxa" w:w="0"/>
-        <w:left w:type="dxa" w:w="108"/>
-        <w:bottom w:type="dxa" w:w="0"/>
-        <w:right w:type="dxa" w:w="108"/>
-      </w:tblCellMar>
-    </w:tblPr>
-  </w:style>
-  <w:style w:default="1" w:styleId="NoList" w:type="numbering">
-    <w:name w:val="No List"/>
-    <w:uiPriority w:val="99"/>
-    <w:semiHidden/>
-    <w:unhideWhenUsed/>
-  </w:style>
-  <w:style w:styleId="BodyText" w:type="paragraph">
+  <w:style w:type="paragraph" w:styleId="BodyText">
     <w:name w:val="Body Text"/>
     <w:basedOn w:val="Normal"/>
+    <w:link w:val="BodyTextChar"/>
     <w:qFormat/>
     <w:pPr>
-      <w:spacing w:after="240" w:before="0"/>
+      <w:spacing w:before="0" w:after="0" w:line="276" w:lineRule="exact"/>
       <w:ind w:firstLine="720"/>
     </w:pPr>
   </w:style>
-  <w:style w:styleId="FirstParagraph" w:type="paragraph">
+  <w:style w:type="paragraph" w:customStyle="1" w:styleId="FirstParagraph">
     <w:name w:val="First Paragraph"/>
     <w:basedOn w:val="BodyText"/>
     <w:next w:val="BodyText"/>
     <w:qFormat/>
   </w:style>
-  <w:style w:customStyle="1" w:styleId="BodyTextKeepNext" w:type="paragraph">
-    <w:name w:val="Body Text Keep Next"/>
-    <w:basedOn w:val="BodyText"/>
-    <w:qFormat/>
-    <w:pPr>
-      <w:keepNext/>
-    </w:pPr>
-  </w:style>
-  <w:style w:styleId="Compact" w:type="paragraph">
+  <w:style w:type="paragraph" w:customStyle="1" w:styleId="Compact">
     <w:name w:val="Compact"/>
     <w:basedOn w:val="BodyText"/>
     <w:qFormat/>
     <w:pPr>
-      <w:spacing w:after="240" w:before="0"/>
-      <w:ind w:firstLine="0"/>
+      <w:spacing w:before="36" w:after="36"/>
     </w:pPr>
   </w:style>
-  <w:style w:styleId="Heading1" w:type="paragraph">
-    <w:name w:val="heading 1"/>
+  <w:style w:type="paragraph" w:styleId="Title">
+    <w:name w:val="Title"/>
     <w:basedOn w:val="Normal"/>
     <w:next w:val="BodyText"/>
-    <w:uiPriority w:val="9"/>
+    <w:link w:val="TitleChar"/>
+    <w:uiPriority w:val="10"/>
+    <w:qFormat/>
+    <w:rsid w:val="00A10FD9"/>
+    <w:pPr>
+      <w:spacing w:after="80" w:line="240" w:lineRule="auto"/>
+      <w:contextualSpacing/>
+      <w:jc w:val="center"/>
+    </w:pPr>
+    <w:rPr>
+      <w:rFonts w:asciiTheme="majorHAnsi" w:eastAsiaTheme="majorEastAsia" w:hAnsiTheme="majorHAnsi" w:cstheme="majorBidi"/>
+      <w:sz w:val="56"/>
+      <w:szCs w:val="56"/>
+    </w:rPr>
+  </w:style>
+  <w:style w:type="character" w:customStyle="1" w:styleId="TitleChar">
+    <w:name w:val="Title Char"/>
+    <w:basedOn w:val="DefaultParagraphFont"/>
+    <w:link w:val="Title"/>
+    <w:uiPriority w:val="10"/>
+    <w:rsid w:val="00A10FD9"/>
+    <w:rPr>
+      <w:rFonts w:asciiTheme="majorHAnsi" w:eastAsiaTheme="majorEastAsia" w:hAnsiTheme="majorHAnsi" w:cstheme="majorBidi"/>
+      <w:sz w:val="56"/>
+      <w:szCs w:val="56"/>
+    </w:rPr>
+  </w:style>
+  <w:style w:type="paragraph" w:styleId="Subtitle">
+    <w:name w:val="Subtitle"/>
+    <w:basedOn w:val="Title"/>
+    <w:next w:val="BodyText"/>
+    <w:link w:val="SubtitleChar"/>
+    <w:uiPriority w:val="11"/>
+    <w:qFormat/>
+    <w:rsid w:val="00A10FD9"/>
+    <w:pPr>
+      <w:numPr>
+        <w:ilvl w:val="1"/>
+      </w:numPr>
+    </w:pPr>
+    <w:rPr>
+      <w:rFonts w:eastAsiaTheme="majorEastAsia" w:cstheme="majorBidi"/>
+      <w:spacing w:val="15"/>
+      <w:sz w:val="28"/>
+      <w:szCs w:val="28"/>
+    </w:rPr>
+  </w:style>
+  <w:style w:type="character" w:customStyle="1" w:styleId="SubtitleChar">
+    <w:name w:val="Subtitle Char"/>
+    <w:basedOn w:val="DefaultParagraphFont"/>
+    <w:link w:val="Subtitle"/>
+    <w:uiPriority w:val="11"/>
+    <w:rsid w:val="00A10FD9"/>
+    <w:rPr>
+      <w:rFonts w:eastAsiaTheme="majorEastAsia" w:cstheme="majorBidi"/>
+      <w:color w:val="595959" w:themeColor="text1" w:themeTint="A6"/>
+      <w:spacing w:val="15"/>
+      <w:sz w:val="28"/>
+      <w:szCs w:val="28"/>
+    </w:rPr>
+  </w:style>
+  <w:style w:type="paragraph" w:customStyle="1" w:styleId="Author">
+    <w:name w:val="Author"/>
+    <w:basedOn w:val="Title"/>
+    <w:next w:val="BodyText"/>
     <w:qFormat/>
     <w:pPr>
       <w:keepNext/>
       <w:keepLines/>
-      <w:spacing w:after="240" w:before="360"/>
+    </w:pPr>
+    <w:rPr>
+      <w:sz w:val="24"/>
+      <w:szCs w:val="24"/>
+    </w:rPr>
+  </w:style>
+  <w:style w:type="paragraph" w:styleId="Date">
+    <w:name w:val="Date"/>
+    <w:basedOn w:val="Title"/>
+    <w:next w:val="BodyText"/>
+    <w:qFormat/>
+    <w:pPr>
+      <w:keepNext/>
+      <w:keepLines/>
+    </w:pPr>
+    <w:rPr>
+      <w:sz w:val="24"/>
+      <w:szCs w:val="24"/>
+    </w:rPr>
+  </w:style>
+  <w:style w:type="paragraph" w:customStyle="1" w:styleId="AbstractTitle">
+    <w:name w:val="Abstract Title"/>
+    <w:basedOn w:val="Normal"/>
+    <w:next w:val="Abstract"/>
+    <w:qFormat/>
+    <w:pPr>
+      <w:keepNext/>
+      <w:keepLines/>
+      <w:spacing w:before="300" w:after="0"/>
+      <w:jc w:val="center"/>
+    </w:pPr>
+    <w:rPr>
+      <w:b/>
+      <w:sz w:val="20"/>
+      <w:szCs w:val="20"/>
+    </w:rPr>
+  </w:style>
+  <w:style w:type="paragraph" w:customStyle="1" w:styleId="Abstract">
+    <w:name w:val="Abstract"/>
+    <w:basedOn w:val="Normal"/>
+    <w:next w:val="BodyText"/>
+    <w:qFormat/>
+    <w:pPr>
+      <w:keepNext/>
+      <w:keepLines/>
+      <w:spacing w:before="100" w:after="300"/>
+    </w:pPr>
+    <w:rPr>
+      <w:sz w:val="20"/>
+      <w:szCs w:val="20"/>
+    </w:rPr>
+  </w:style>
+  <w:style w:type="paragraph" w:styleId="Bibliography">
+    <w:name w:val="Bibliography"/>
+    <w:basedOn w:val="Normal"/>
+    <w:next w:val="Bibliography"/>
+    <w:qFormat/>
+    <w:pPr/>
+    <w:rPr/>
+  </w:style>
+  <w:style w:type="paragraph" w:styleId="Heading1">
+    <w:name w:val="heading 1"/>
+    <w:basedOn w:val="Normal"/>
+    <w:next w:val="BodyText"/>
+    <w:link w:val="Heading1Char"/>
+    <w:uiPriority w:val="9"/>
+    <w:qFormat/>
+    <w:rsid w:val="00A10FD9"/>
+    <w:pPr>
+      <w:keepNext/>
+      <w:keepLines/>
+      <w:spacing w:before="360" w:after="240" w:line="276" w:lineRule="exact"/>
       <w:ind w:firstLine="0"/>
       <w:jc w:val="center"/>
       <w:outlineLvl w:val="0"/>
     </w:pPr>
     <w:rPr>
+      <w:rFonts w:ascii="Times New Roman" w:hAnsi="Times New Roman" w:eastAsia="Times New Roman" w:cs="Times New Roman"/>
       <w:b/>
       <w:bCs/>
-    </w:rPr>
-  </w:style>
-  <w:style w:styleId="Heading2" w:type="paragraph">
+      <w:caps/>
+      <w:color w:val="000000"/>
+      <w:sz w:val="24"/>
+      <w:szCs w:val="24"/>
+    </w:rPr>
+  </w:style>
+  <w:style w:type="paragraph" w:styleId="Heading2">
     <w:name w:val="heading 2"/>
     <w:basedOn w:val="Normal"/>
+    <w:next w:val="BodyText"/>
+    <w:link w:val="Heading2Char"/>
+    <w:uiPriority w:val="9"/>
+    <w:semiHidden/>
+    <w:unhideWhenUsed/>
+    <w:qFormat/>
+    <w:rsid w:val="00A10FD9"/>
+    <w:pPr>
+      <w:keepNext/>
+      <w:keepLines/>
+      <w:spacing w:before="360" w:after="240" w:line="276" w:lineRule="exact"/>
+      <w:ind w:firstLine="0"/>
+      <w:outlineLvl w:val="1"/>
+    </w:pPr>
+    <w:rPr>
+      <w:rFonts w:ascii="Times New Roman" w:hAnsi="Times New Roman" w:eastAsia="Times New Roman" w:cs="Times New Roman"/>
+      <w:b/>
+      <w:bCs/>
+      <w:color w:val="000000"/>
+      <w:sz w:val="24"/>
+      <w:szCs w:val="24"/>
+    </w:rPr>
+  </w:style>
+  <w:style w:type="paragraph" w:styleId="Heading3">
+    <w:name w:val="heading 3"/>
+    <w:basedOn w:val="Normal"/>
+    <w:next w:val="BodyText"/>
+    <w:link w:val="Heading3Char"/>
+    <w:uiPriority w:val="9"/>
+    <w:semiHidden/>
+    <w:unhideWhenUsed/>
+    <w:qFormat/>
+    <w:rsid w:val="00A10FD9"/>
+    <w:pPr>
+      <w:keepNext/>
+      <w:keepLines/>
+      <w:spacing w:before="360" w:after="240" w:line="276" w:lineRule="exact"/>
+      <w:ind w:firstLine="0"/>
+      <w:outlineLvl w:val="2"/>
+    </w:pPr>
+    <w:rPr>
+      <w:rFonts w:ascii="Times New Roman" w:hAnsi="Times New Roman" w:eastAsia="Times New Roman" w:cs="Times New Roman"/>
+      <w:b/>
+      <w:bCs/>
+      <w:color w:val="000000"/>
+      <w:sz w:val="24"/>
+      <w:szCs w:val="24"/>
+    </w:rPr>
+  </w:style>
+  <w:style w:type="paragraph" w:styleId="Heading4">
+    <w:name w:val="heading 4"/>
+    <w:basedOn w:val="Normal"/>
+    <w:next w:val="BodyText"/>
+    <w:link w:val="Heading4Char"/>
+    <w:uiPriority w:val="9"/>
+    <w:semiHidden/>
+    <w:unhideWhenUsed/>
+    <w:qFormat/>
+    <w:rsid w:val="00A10FD9"/>
+    <w:pPr>
+      <w:keepNext/>
+      <w:keepLines/>
+      <w:spacing w:before="360" w:after="240" w:line="276" w:lineRule="exact"/>
+      <w:ind w:firstLine="0"/>
+      <w:outlineLvl w:val="3"/>
+    </w:pPr>
+    <w:rPr>
+      <w:rFonts w:ascii="Times New Roman" w:hAnsi="Times New Roman" w:eastAsia="Times New Roman" w:cs="Times New Roman"/>
+      <w:b/>
+      <w:bCs/>
+      <w:i/>
+      <w:color w:val="000000"/>
+      <w:sz w:val="24"/>
+      <w:szCs w:val="24"/>
+    </w:rPr>
+  </w:style>
+  <w:style w:type="paragraph" w:styleId="Heading5">
+    <w:name w:val="heading 5"/>
+    <w:basedOn w:val="Normal"/>
+    <w:next w:val="BodyText"/>
+    <w:link w:val="Heading5Char"/>
+    <w:uiPriority w:val="9"/>
+    <w:semiHidden/>
+    <w:unhideWhenUsed/>
+    <w:qFormat/>
+    <w:rsid w:val="00A10FD9"/>
+    <w:pPr>
+      <w:keepNext/>
+      <w:keepLines/>
+      <w:spacing w:before="360" w:after="240" w:line="276" w:lineRule="exact"/>
+      <w:ind w:firstLine="0"/>
+      <w:outlineLvl w:val="4"/>
+    </w:pPr>
+    <w:rPr>
+      <w:rFonts w:ascii="Times New Roman" w:hAnsi="Times New Roman" w:eastAsia="Times New Roman" w:cs="Times New Roman"/>
+      <w:b/>
+      <w:bCs/>
+      <w:i/>
+      <w:color w:val="000000"/>
+      <w:sz w:val="24"/>
+      <w:szCs w:val="24"/>
+    </w:rPr>
+  </w:style>
+  <w:style w:type="paragraph" w:styleId="Heading6">
+    <w:name w:val="heading 6"/>
+    <w:basedOn w:val="Normal"/>
+    <w:next w:val="BodyText"/>
+    <w:link w:val="Heading6Char"/>
+    <w:uiPriority w:val="9"/>
+    <w:semiHidden/>
+    <w:unhideWhenUsed/>
+    <w:qFormat/>
+    <w:rsid w:val="00A10FD9"/>
+    <w:pPr>
+      <w:keepNext/>
+      <w:keepLines/>
+      <w:spacing w:before="40" w:after="0"/>
+      <w:outlineLvl w:val="5"/>
+    </w:pPr>
+    <w:rPr>
+      <w:rFonts w:eastAsiaTheme="majorEastAsia" w:cstheme="majorBidi"/>
+      <w:i/>
+      <w:iCs/>
+      <w:color w:val="595959" w:themeColor="text1" w:themeTint="A6"/>
+    </w:rPr>
+  </w:style>
+  <w:style w:type="paragraph" w:styleId="Heading7">
+    <w:name w:val="heading 7"/>
+    <w:basedOn w:val="Normal"/>
+    <w:next w:val="BodyText"/>
+    <w:link w:val="Heading7Char"/>
+    <w:uiPriority w:val="9"/>
+    <w:semiHidden/>
+    <w:unhideWhenUsed/>
+    <w:qFormat/>
+    <w:rsid w:val="00A10FD9"/>
+    <w:pPr>
+      <w:keepNext/>
+      <w:keepLines/>
+      <w:spacing w:before="40" w:after="0"/>
+      <w:outlineLvl w:val="6"/>
+    </w:pPr>
+    <w:rPr>
+      <w:rFonts w:eastAsiaTheme="majorEastAsia" w:cstheme="majorBidi"/>
+      <w:color w:val="595959" w:themeColor="text1" w:themeTint="A6"/>
+    </w:rPr>
+  </w:style>
+  <w:style w:type="paragraph" w:styleId="Heading8">
+    <w:name w:val="heading 8"/>
+    <w:basedOn w:val="Normal"/>
+    <w:next w:val="BodyText"/>
+    <w:link w:val="Heading8Char"/>
+    <w:uiPriority w:val="9"/>
+    <w:semiHidden/>
+    <w:unhideWhenUsed/>
+    <w:qFormat/>
+    <w:rsid w:val="00A10FD9"/>
+    <w:pPr>
+      <w:keepNext/>
+      <w:keepLines/>
+      <w:spacing w:after="0"/>
+      <w:outlineLvl w:val="7"/>
+    </w:pPr>
+    <w:rPr>
+      <w:rFonts w:eastAsiaTheme="majorEastAsia" w:cstheme="majorBidi"/>
+      <w:i/>
+      <w:iCs/>
+      <w:color w:val="272727" w:themeColor="text1" w:themeTint="D8"/>
+    </w:rPr>
+  </w:style>
+  <w:style w:type="paragraph" w:styleId="Heading9">
+    <w:name w:val="heading 9"/>
+    <w:basedOn w:val="Normal"/>
+    <w:next w:val="BodyText"/>
+    <w:link w:val="Heading9Char"/>
+    <w:uiPriority w:val="9"/>
+    <w:semiHidden/>
+    <w:unhideWhenUsed/>
+    <w:qFormat/>
+    <w:rsid w:val="00A10FD9"/>
+    <w:pPr>
+      <w:keepNext/>
+      <w:keepLines/>
+      <w:spacing w:after="0"/>
+      <w:outlineLvl w:val="8"/>
+    </w:pPr>
+    <w:rPr>
+      <w:rFonts w:eastAsiaTheme="majorEastAsia" w:cstheme="majorBidi"/>
+      <w:color w:val="272727" w:themeColor="text1" w:themeTint="D8"/>
+    </w:rPr>
+  </w:style>
+  <w:style w:type="character" w:customStyle="1" w:styleId="Heading1Char">
+    <w:name w:val="Heading 1 Char"/>
+    <w:basedOn w:val="DefaultParagraphFont"/>
+    <w:link w:val="Heading1"/>
+    <w:uiPriority w:val="9"/>
+    <w:rsid w:val="00A10FD9"/>
+    <w:rPr>
+      <w:rFonts w:asciiTheme="majorHAnsi" w:eastAsiaTheme="majorEastAsia" w:hAnsiTheme="majorHAnsi" w:cstheme="majorBidi"/>
+      <w:color w:val="0F4761" w:themeColor="accent1" w:themeShade="BF"/>
+      <w:sz w:val="40"/>
+      <w:szCs w:val="40"/>
+    </w:rPr>
+  </w:style>
+  <w:style w:type="character" w:customStyle="1" w:styleId="Heading2Char">
+    <w:name w:val="Heading 2 Char"/>
+    <w:basedOn w:val="DefaultParagraphFont"/>
+    <w:link w:val="Heading2"/>
+    <w:uiPriority w:val="9"/>
+    <w:semiHidden/>
+    <w:rsid w:val="00A10FD9"/>
+    <w:rPr>
+      <w:rFonts w:asciiTheme="majorHAnsi" w:eastAsiaTheme="majorEastAsia" w:hAnsiTheme="majorHAnsi" w:cstheme="majorBidi"/>
+      <w:color w:val="0F4761" w:themeColor="accent1" w:themeShade="BF"/>
+      <w:sz w:val="32"/>
+      <w:szCs w:val="32"/>
+    </w:rPr>
+  </w:style>
+  <w:style w:type="character" w:customStyle="1" w:styleId="Heading3Char">
+    <w:name w:val="Heading 3 Char"/>
+    <w:basedOn w:val="DefaultParagraphFont"/>
+    <w:link w:val="Heading3"/>
+    <w:uiPriority w:val="9"/>
+    <w:semiHidden/>
+    <w:rsid w:val="00A10FD9"/>
+    <w:rPr>
+      <w:rFonts w:eastAsiaTheme="majorEastAsia" w:cstheme="majorBidi"/>
+      <w:color w:val="0F4761" w:themeColor="accent1" w:themeShade="BF"/>
+      <w:sz w:val="28"/>
+      <w:szCs w:val="28"/>
+    </w:rPr>
+  </w:style>
+  <w:style w:type="character" w:customStyle="1" w:styleId="Heading4Char">
+    <w:name w:val="Heading 4 Char"/>
+    <w:basedOn w:val="DefaultParagraphFont"/>
+    <w:link w:val="Heading4"/>
+    <w:uiPriority w:val="9"/>
+    <w:semiHidden/>
+    <w:rsid w:val="00A10FD9"/>
+    <w:rPr>
+      <w:rFonts w:eastAsiaTheme="majorEastAsia" w:cstheme="majorBidi"/>
+      <w:i/>
+      <w:iCs/>
+      <w:color w:val="0F4761" w:themeColor="accent1" w:themeShade="BF"/>
+    </w:rPr>
+  </w:style>
+  <w:style w:type="character" w:customStyle="1" w:styleId="Heading5Char">
+    <w:name w:val="Heading 5 Char"/>
+    <w:basedOn w:val="DefaultParagraphFont"/>
+    <w:link w:val="Heading5"/>
+    <w:uiPriority w:val="9"/>
+    <w:semiHidden/>
+    <w:rsid w:val="00A10FD9"/>
+    <w:rPr>
+      <w:rFonts w:eastAsiaTheme="majorEastAsia" w:cstheme="majorBidi"/>
+      <w:color w:val="0F4761" w:themeColor="accent1" w:themeShade="BF"/>
+    </w:rPr>
+  </w:style>
+  <w:style w:type="character" w:customStyle="1" w:styleId="Heading6Char">
+    <w:name w:val="Heading 6 Char"/>
+    <w:basedOn w:val="DefaultParagraphFont"/>
+    <w:link w:val="Heading6"/>
+    <w:uiPriority w:val="9"/>
+    <w:semiHidden/>
+    <w:rsid w:val="00A10FD9"/>
+    <w:rPr>
+      <w:rFonts w:eastAsiaTheme="majorEastAsia" w:cstheme="majorBidi"/>
+      <w:i/>
+      <w:iCs/>
+      <w:color w:val="595959" w:themeColor="text1" w:themeTint="A6"/>
+    </w:rPr>
+  </w:style>
+  <w:style w:type="character" w:customStyle="1" w:styleId="Heading7Char">
+    <w:name w:val="Heading 7 Char"/>
+    <w:basedOn w:val="DefaultParagraphFont"/>
+    <w:link w:val="Heading7"/>
+    <w:uiPriority w:val="9"/>
+    <w:semiHidden/>
+    <w:rsid w:val="00A10FD9"/>
+    <w:rPr>
+      <w:rFonts w:eastAsiaTheme="majorEastAsia" w:cstheme="majorBidi"/>
+      <w:color w:val="595959" w:themeColor="text1" w:themeTint="A6"/>
+    </w:rPr>
+  </w:style>
+  <w:style w:type="character" w:customStyle="1" w:styleId="Heading8Char">
+    <w:name w:val="Heading 8 Char"/>
+    <w:basedOn w:val="DefaultParagraphFont"/>
+    <w:link w:val="Heading8"/>
+    <w:uiPriority w:val="9"/>
+    <w:semiHidden/>
+    <w:rsid w:val="00A10FD9"/>
+    <w:rPr>
+      <w:rFonts w:eastAsiaTheme="majorEastAsia" w:cstheme="majorBidi"/>
+      <w:i/>
+      <w:iCs/>
+      <w:color w:val="272727" w:themeColor="text1" w:themeTint="D8"/>
+    </w:rPr>
+  </w:style>
+  <w:style w:type="character" w:customStyle="1" w:styleId="Heading9Char">
+    <w:name w:val="Heading 9 Char"/>
+    <w:basedOn w:val="DefaultParagraphFont"/>
+    <w:link w:val="Heading9"/>
+    <w:uiPriority w:val="9"/>
+    <w:semiHidden/>
+    <w:rsid w:val="00A10FD9"/>
+    <w:rPr>
+      <w:rFonts w:eastAsiaTheme="majorEastAsia" w:cstheme="majorBidi"/>
+      <w:color w:val="272727" w:themeColor="text1" w:themeTint="D8"/>
+    </w:rPr>
+  </w:style>
+  <w:style w:type="paragraph" w:customStyle="1" w:styleId="ListItem">
+    <w:name w:val="List Item"/>
+    <w:basedOn w:val="BodyText"/>
+    <w:qFormat/>
+    <w:pPr>
+      <w:spacing w:before="0" w:after="0" w:line="276" w:lineRule="exact"/>
+      <w:ind w:left="720" w:hanging="720"/>
+    </w:pPr>
+  </w:style>
+  <w:style w:type="paragraph" w:styleId="BlockText">
+    <w:name w:val="Block Text"/>
+    <w:basedOn w:val="BodyText"/>
     <w:next w:val="BodyText"/>
     <w:uiPriority w:val="9"/>
     <w:unhideWhenUsed/>
     <w:qFormat/>
     <w:pPr>
+      <w:spacing w:before="280" w:after="280" w:line="276" w:lineRule="exact"/>
+      <w:ind w:firstLine="0" w:left="720" w:right="720"/>
+    </w:pPr>
+  </w:style>
+  <w:style w:type="paragraph" w:styleId="FootnoteText">
+    <w:name w:val="Footnote Text"/>
+    <w:basedOn w:val="Normal"/>
+    <w:next w:val="FootnoteText"/>
+    <w:uiPriority w:val="9"/>
+    <w:unhideWhenUsed/>
+    <w:qFormat/>
+    <w:pPr>
+      <w:keepLines/>
+      <w:spacing w:before="0" w:after="140" w:line="276" w:lineRule="exact"/>
+    </w:pPr>
+    <w:rPr>
+      <w:sz w:val="24"/>
+      <w:szCs w:val="24"/>
+    </w:rPr>
+  </w:style>
+  <w:style w:type="paragraph" w:styleId="FootnoteBlockText">
+    <w:name w:val="Footnote Block Text"/>
+    <w:basedOn w:val="FootnoteText"/>
+    <w:next w:val="FootnoteText"/>
+    <w:uiPriority w:val="9"/>
+    <w:unhideWhenUsed/>
+    <w:qFormat/>
+    <w:pPr>
+      <w:spacing w:before="280" w:after="280"/>
+      <w:ind w:firstLine="0" w:left="720" w:right="720"/>
+    </w:pPr>
+  </w:style>
+  <w:style w:type="character" w:default="1" w:styleId="DefaultParagraphFont">
+    <w:name w:val="Default Paragraph Font"/>
+    <w:semiHidden/>
+    <w:unhideWhenUsed/>
+  </w:style>
+  <w:style w:type="table" w:default="1" w:styleId="Table">
+    <w:name w:val="Table"/>
+    <w:basedOn w:val="TableNormal"/>
+    <w:qFormat/>
+    <w:tblPr>
+      <w:tblInd w:w="0" w:type="dxa"/>
+      <w:tblCellMar>
+        <w:top w:w="0" w:type="dxa"/>
+        <w:left w:w="108" w:type="dxa"/>
+        <w:bottom w:w="0" w:type="dxa"/>
+        <w:right w:w="108" w:type="dxa"/>
+      </w:tblCellMar>
+    </w:tblPr>
+    <w:tblStylePr w:type="firstRow">
+      <w:tcPr>
+        <w:tcBorders>
+          <w:bottom w:val="single"/>
+        </w:tcBorders>
+        <w:vAlign w:val="bottom"/>
+      </w:tcPr>
+    </w:tblStylePr>
+  </w:style>
+  <w:style w:type="paragraph" w:customStyle="1" w:styleId="DefinitionTerm">
+    <w:name w:val="Definition Term"/>
+    <w:basedOn w:val="Normal"/>
+    <w:next w:val="Definition"/>
+    <w:pPr>
       <w:keepNext/>
       <w:keepLines/>
-      <w:spacing w:after="240" w:before="240"/>
-      <w:ind w:firstLine="0"/>
-      <w:outlineLvl w:val="1"/>
+      <w:spacing w:after="0"/>
     </w:pPr>
     <w:rPr>
       <w:b/>
-      <w:bCs/>
-    </w:rPr>
-  </w:style>
-  <w:style w:styleId="FootnoteText" w:type="paragraph">
-    <w:name w:val="footnote text"/>
+    </w:rPr>
+  </w:style>
+  <w:style w:type="paragraph" w:customStyle="1" w:styleId="Definition">
+    <w:name w:val="Definition"/>
     <w:basedOn w:val="Normal"/>
-    <w:uiPriority w:val="99"/>
+  </w:style>
+  <w:style w:type="paragraph" w:styleId="Caption">
+    <w:name w:val="Caption"/>
+    <w:basedOn w:val="Normal"/>
+    <w:link w:val="BodyTextChar"/>
+    <w:pPr>
+      <w:spacing w:before="0" w:after="120"/>
+    </w:pPr>
+    <w:rPr>
+      <w:i/>
+    </w:rPr>
+  </w:style>
+  <w:style w:type="paragraph" w:customStyle="1" w:styleId="TableCaption">
+    <w:name w:val="Table Caption"/>
+    <w:basedOn w:val="Caption"/>
+    <w:pPr>
+      <w:keepNext/>
+    </w:pPr>
+  </w:style>
+  <w:style w:type="paragraph" w:customStyle="1" w:styleId="ImageCaption">
+    <w:name w:val="Image Caption"/>
+    <w:basedOn w:val="Caption"/>
+  </w:style>
+  <w:style w:type="paragraph" w:customStyle="1" w:styleId="Figure">
+    <w:name w:val="Figure"/>
+    <w:basedOn w:val="Normal"/>
+  </w:style>
+  <w:style w:type="paragraph" w:customStyle="1" w:styleId="CaptionedFigure">
+    <w:name w:val="Captioned Figure"/>
+    <w:basedOn w:val="Figure"/>
+    <w:pPr>
+      <w:keepNext/>
+    </w:pPr>
+  </w:style>
+  <w:style w:type="character" w:customStyle="1" w:styleId="BodyTextChar">
+    <w:name w:val="Body Text Char"/>
+    <w:basedOn w:val="DefaultParagraphFont"/>
+    <w:link w:val="BodyText"/>
+  </w:style>
+  <w:style w:type="character" w:customStyle="1" w:styleId="VerbatimChar">
+    <w:name w:val="Verbatim Char"/>
+    <w:basedOn w:val="BodyTextChar"/>
+    <w:rPr>
+      <w:rFonts w:ascii="Consolas" w:hAnsi="Consolas"/>
+      <w:sz w:val="22"/>
+    </w:rPr>
+  </w:style>
+  <w:style w:type="character" w:customStyle="1" w:styleId="SectionNumber">
+    <w:name w:val="Section Number"/>
+    <w:basedOn w:val="BodyTextChar"/>
+  </w:style>
+  <w:style w:type="character" w:styleId="FootnoteReference">
+    <w:name w:val="Footnote Reference"/>
+    <w:basedOn w:val="BodyTextChar"/>
+    <w:rPr>
+      <w:vertAlign w:val="superscript"/>
+    </w:rPr>
+  </w:style>
+  <w:style w:type="character" w:styleId="Hyperlink">
+    <w:name w:val="Hyperlink"/>
+    <w:basedOn w:val="BodyTextChar"/>
+    <w:rPr>
+      <w:color w:val="000000"/>
+    </w:rPr>
+  </w:style>
+  <w:style w:type="paragraph" w:styleId="TOCHeading">
+    <w:name w:val="TOC Heading"/>
+    <w:basedOn w:val="Heading1"/>
+    <w:next w:val="BodyText"/>
+    <w:uiPriority w:val="39"/>
     <w:unhideWhenUsed/>
+    <w:qFormat/>
     <w:pPr>
-      <w:spacing w:after="0" w:before="0" w:line="240" w:lineRule="auto"/>
-      <w:ind w:firstLine="0"/>
+      <w:spacing w:before="240" w:line="259" w:lineRule="auto"/>
+      <w:outlineLvl w:val="9"/>
     </w:pPr>
     <w:rPr>
-      <w:sz w:val="20"/>
-      <w:szCs w:val="20"/>
-    </w:rPr>
-  </w:style>
-  <w:style w:styleId="FootnoteReference" w:type="character">
-    <w:name w:val="footnote reference"/>
-    <w:basedOn w:val="DefaultParagraphFont"/>
-    <w:uiPriority w:val="99"/>
-    <w:unhideWhenUsed/>
-    <w:rPr>
-      <w:vertAlign w:val="superscript"/>
-    </w:rPr>
-  </w:style>
-  <w:style w:styleId="Hyperlink" w:type="character">
-    <w:name w:val="Hyperlink"/>
-    <w:basedOn w:val="DefaultParagraphFont"/>
-    <w:uiPriority w:val="99"/>
-    <w:unhideWhenUsed/>
-    <w:rPr>
-      <w:color w:val="000000"/>
-      <w:u w:val="single"/>
-    </w:rPr>
-  </w:style>
-  <w:style w:styleId="Footer" w:type="paragraph">
-    <w:name w:val="footer"/>
-    <w:basedOn w:val="Normal"/>
-    <w:uiPriority w:val="99"/>
-    <w:unhideWhenUsed/>
-    <w:pPr>
-      <w:spacing w:after="0" w:before="0" w:line="240" w:lineRule="auto"/>
-      <w:ind w:firstLine="0"/>
-      <w:jc w:val="center"/>
-    </w:pPr>
-    <w:rPr>
-      <w:sz w:val="20"/>
-      <w:szCs w:val="20"/>
-    </w:rPr>
-  </w:style>
-  <w:style w:styleId="Table" w:type="table">
-    <w:name w:val="Table"/>
-    <w:basedOn w:val="TableNormal"/>
-    <w:uiPriority w:val="59"/>
-    <w:pPr>
-      <w:spacing w:after="0" w:line="240" w:lineRule="auto"/>
-    </w:pPr>
-    <w:tblPr>
-      <w:tblBorders>
-        <w:top w:val="nil"/>
-        <w:left w:val="nil"/>
-        <w:bottom w:val="nil"/>
-        <w:right w:val="nil"/>
-        <w:insideH w:val="nil"/>
-        <w:insideV w:val="nil"/>
-      </w:tblBorders>
-    </w:tblPr>
+      <w:rFonts w:asciiTheme="majorHAnsi" w:eastAsiaTheme="majorEastAsia" w:hAnsiTheme="majorHAnsi" w:cstheme="majorBidi"/>
+      <w:b w:val="0"/>
+      <w:bCs w:val="0"/>
+      <w:color w:val="365F91" w:themeColor="accent1" w:themeShade="BF"/>
+    </w:rPr>
   </w:style>
   <w:style w:type="paragraph" w:customStyle="1" w:styleId="SourceCode">
     <w:name w:val="Source Code"/>

</xml_diff>